<commit_message>
Update A Systematic Review of Keypoint Detection in Plant Phenotyping Algorithms, Applications, and Quantitative Performance.docx
</commit_message>
<xml_diff>
--- a/A Systematic Review of Keypoint Detection in Plant Phenotyping Algorithms, Applications, and Quantitative Performance.docx
+++ b/A Systematic Review of Keypoint Detection in Plant Phenotyping Algorithms, Applications, and Quantitative Performance.docx
@@ -14,7 +14,6 @@
           <w:szCs w:val="32"/>
         </w:rPr>
       </w:pPr>
-      <w:proofErr w:type="spellStart"/>
       <w:r>
         <w:rPr>
           <w:rFonts w:ascii="Times New Roman" w:hAnsi="Times New Roman" w:cs="Times New Roman"/>
@@ -23,18 +22,7 @@
           <w:sz w:val="28"/>
           <w:szCs w:val="32"/>
         </w:rPr>
-        <w:t>Keypoint</w:t>
-      </w:r>
-      <w:proofErr w:type="spellEnd"/>
-      <w:r>
-        <w:rPr>
-          <w:rFonts w:ascii="Times New Roman" w:hAnsi="Times New Roman" w:cs="Times New Roman"/>
-          <w:b/>
-          <w:bCs/>
-          <w:sz w:val="28"/>
-          <w:szCs w:val="32"/>
-        </w:rPr>
-        <w:t xml:space="preserve"> Detection in Plant Phenotyping: A Systematic Review of Methods, Challenges, and Emerging Trends</w:t>
+        <w:t>Keypoint Detection in Plant Phenotyping: A Systematic Review of Methods, Challenges, and Emerging Trends</w:t>
       </w:r>
     </w:p>
     <w:p>
@@ -186,33 +174,11 @@
           <w:rFonts w:ascii="Times New Roman" w:hAnsi="Times New Roman" w:cs="Times New Roman"/>
         </w:rPr>
       </w:pPr>
-      <w:proofErr w:type="spellStart"/>
-      <w:r>
-        <w:rPr>
-          <w:rFonts w:ascii="Times New Roman" w:hAnsi="Times New Roman" w:cs="Times New Roman"/>
-        </w:rPr>
-        <w:t>Keypoint</w:t>
-      </w:r>
-      <w:proofErr w:type="spellEnd"/>
-      <w:r>
-        <w:rPr>
-          <w:rFonts w:ascii="Times New Roman" w:hAnsi="Times New Roman" w:cs="Times New Roman"/>
-        </w:rPr>
-        <w:t xml:space="preserve"> detection has emerged as a critical step in automated plant phenotyping, enabling precise measurement of morphological traits, organ localization, and structural modeling from high-throughput image data. Despite rapid advances in imaging technologies and computer vision algorithms, research on plant </w:t>
-      </w:r>
-      <w:proofErr w:type="spellStart"/>
-      <w:r>
-        <w:rPr>
-          <w:rFonts w:ascii="Times New Roman" w:hAnsi="Times New Roman" w:cs="Times New Roman"/>
-        </w:rPr>
-        <w:t>keypoint</w:t>
-      </w:r>
-      <w:proofErr w:type="spellEnd"/>
-      <w:r>
-        <w:rPr>
-          <w:rFonts w:ascii="Times New Roman" w:hAnsi="Times New Roman" w:cs="Times New Roman"/>
-        </w:rPr>
-        <w:t xml:space="preserve"> detection remains fragmented across species, modalities, and experimental conditions.</w:t>
+      <w:r>
+        <w:rPr>
+          <w:rFonts w:ascii="Times New Roman" w:hAnsi="Times New Roman" w:cs="Times New Roman"/>
+        </w:rPr>
+        <w:t>Keypoint detection has emerged as a critical step in automated plant phenotyping, enabling precise measurement of morphological traits, organ localization, and structural modeling from high-throughput image data. Despite rapid advances in imaging technologies and computer vision algorithms, research on plant keypoint detection remains fragmented across species, modalities, and experimental conditions.</w:t>
       </w:r>
     </w:p>
     <w:p>
@@ -226,21 +192,7 @@
         <w:rPr>
           <w:rFonts w:ascii="Times New Roman" w:hAnsi="Times New Roman" w:cs="Times New Roman"/>
         </w:rPr>
-        <w:t xml:space="preserve">This study presents a systematic literature review (SLR) of </w:t>
-      </w:r>
-      <w:proofErr w:type="spellStart"/>
-      <w:r>
-        <w:rPr>
-          <w:rFonts w:ascii="Times New Roman" w:hAnsi="Times New Roman" w:cs="Times New Roman"/>
-        </w:rPr>
-        <w:t>keypoint</w:t>
-      </w:r>
-      <w:proofErr w:type="spellEnd"/>
-      <w:r>
-        <w:rPr>
-          <w:rFonts w:ascii="Times New Roman" w:hAnsi="Times New Roman" w:cs="Times New Roman"/>
-        </w:rPr>
-        <w:t xml:space="preserve"> detection techniques applied to plant phenotyping, covering works published between </w:t>
+        <w:t xml:space="preserve">This study presents a systematic literature review (SLR) of keypoint detection techniques applied to plant phenotyping, covering works published between </w:t>
       </w:r>
       <w:r>
         <w:rPr>
@@ -296,21 +248,7 @@
         <w:rPr>
           <w:rFonts w:ascii="Times New Roman" w:hAnsi="Times New Roman" w:cs="Times New Roman"/>
         </w:rPr>
-        <w:t xml:space="preserve">The reviewed studies are categorized into three major groups: (1) traditional image processing and feature-based approaches, (2) deep learning architectures such as CNNs, stacked hourglass, and transformer-based models, and (3) multimodal and 3D </w:t>
-      </w:r>
-      <w:proofErr w:type="spellStart"/>
-      <w:r>
-        <w:rPr>
-          <w:rFonts w:ascii="Times New Roman" w:hAnsi="Times New Roman" w:cs="Times New Roman"/>
-        </w:rPr>
-        <w:t>keypoint</w:t>
-      </w:r>
-      <w:proofErr w:type="spellEnd"/>
-      <w:r>
-        <w:rPr>
-          <w:rFonts w:ascii="Times New Roman" w:hAnsi="Times New Roman" w:cs="Times New Roman"/>
-        </w:rPr>
-        <w:t xml:space="preserve"> detection frameworks. We further summarize the applications of these methods in leaf tip localization, stem node detection, panicle structure analysis, and organ-level trait extraction. Quantitative performance comparisons reveal that deep learning methods consistently outperform traditional approaches in accuracy and robustness, although challenges persist in data diversity, annotation cost, and generalization across environments.</w:t>
+        <w:t>The reviewed studies are categorized into three major groups: (1) traditional image processing and feature-based approaches, (2) deep learning architectures such as CNNs, stacked hourglass, and transformer-based models, and (3) multimodal and 3D keypoint detection frameworks. We further summarize the applications of these methods in leaf tip localization, stem node detection, panicle structure analysis, and organ-level trait extraction. Quantitative performance comparisons reveal that deep learning methods consistently outperform traditional approaches in accuracy and robustness, although challenges persist in data diversity, annotation cost, and generalization across environments.</w:t>
       </w:r>
     </w:p>
     <w:p>
@@ -324,21 +262,7 @@
         <w:rPr>
           <w:rFonts w:ascii="Times New Roman" w:hAnsi="Times New Roman" w:cs="Times New Roman"/>
         </w:rPr>
-        <w:t xml:space="preserve">Finally, we highlight key trends and research gaps, including the need for standardized benchmarks, integration of multimodal sensing, and adoption of self-supervised or foundation models for large-scale phenotyping. This review provides a comprehensive synthesis of current progress and future opportunities in </w:t>
-      </w:r>
-      <w:proofErr w:type="spellStart"/>
-      <w:r>
-        <w:rPr>
-          <w:rFonts w:ascii="Times New Roman" w:hAnsi="Times New Roman" w:cs="Times New Roman"/>
-        </w:rPr>
-        <w:t>keypoint</w:t>
-      </w:r>
-      <w:proofErr w:type="spellEnd"/>
-      <w:r>
-        <w:rPr>
-          <w:rFonts w:ascii="Times New Roman" w:hAnsi="Times New Roman" w:cs="Times New Roman"/>
-        </w:rPr>
-        <w:t xml:space="preserve"> detection for plant phenotyping, serving as a foundation for the development of next-generation phenotyping pipelines</w:t>
+        <w:t>Finally, we highlight key trends and research gaps, including the need for standardized benchmarks, integration of multimodal sensing, and adoption of self-supervised or foundation models for large-scale phenotyping. This review provides a comprehensive synthesis of current progress and future opportunities in keypoint detection for plant phenotyping, serving as a foundation for the development of next-generation phenotyping pipelines</w:t>
       </w:r>
       <w:r>
         <w:rPr>
@@ -446,23 +370,7 @@
           <w:sz w:val="16"/>
           <w:szCs w:val="16"/>
         </w:rPr>
-        <w:t>“关键点检测（</w:t>
-      </w:r>
-      <w:proofErr w:type="spellStart"/>
-      <w:r>
-        <w:rPr>
-          <w:sz w:val="16"/>
-          <w:szCs w:val="16"/>
-        </w:rPr>
-        <w:t>keypoint</w:t>
-      </w:r>
-      <w:proofErr w:type="spellEnd"/>
-      <w:r>
-        <w:rPr>
-          <w:sz w:val="16"/>
-          <w:szCs w:val="16"/>
-        </w:rPr>
-        <w:t xml:space="preserve"> detection）”是实现植物器官识别、姿态估计、结构建模的重要步骤（如茎尖、叶节点、果实顶点定位）。</w:t>
+        <w:t>“关键点检测（keypoint detection）”是实现植物器官识别、姿态估计、结构建模的重要步骤（如茎尖、叶节点、果实顶点定位）。</w:t>
       </w:r>
       <w:r>
         <w:rPr>
@@ -517,23 +425,13 @@
         </w:rPr>
         <w:t>高级</w:t>
       </w:r>
-      <w:proofErr w:type="gramStart"/>
       <w:r>
         <w:rPr>
           <w:rStyle w:val="af4"/>
           <w:sz w:val="16"/>
           <w:szCs w:val="16"/>
         </w:rPr>
-        <w:t>子任务</w:t>
-      </w:r>
-      <w:proofErr w:type="gramEnd"/>
-      <w:r>
-        <w:rPr>
-          <w:rStyle w:val="af4"/>
-          <w:sz w:val="16"/>
-          <w:szCs w:val="16"/>
-        </w:rPr>
-        <w:t>缺乏系统性总结</w:t>
+        <w:t>子任务缺乏系统性总结</w:t>
       </w:r>
       <w:r>
         <w:rPr>
@@ -602,124 +500,24 @@
           <w:sz w:val="16"/>
           <w:szCs w:val="16"/>
         </w:rPr>
-        <w:t xml:space="preserve"> (</w:t>
-      </w:r>
-      <w:proofErr w:type="spellStart"/>
+        <w:t xml:space="preserve"> (HRNet) → Transformer (ViTPose, PoseFormer) → </w:t>
+      </w:r>
       <w:r>
         <w:rPr>
           <w:rFonts w:ascii="Times New Roman" w:hAnsi="Times New Roman" w:cs="Times New Roman"/>
           <w:sz w:val="16"/>
           <w:szCs w:val="16"/>
         </w:rPr>
-        <w:t>HRNet</w:t>
-      </w:r>
-      <w:proofErr w:type="spellEnd"/>
+        <w:t>大模型统一方法</w:t>
+      </w:r>
       <w:r>
         <w:rPr>
           <w:rFonts w:ascii="Times New Roman" w:hAnsi="Times New Roman" w:cs="Times New Roman"/>
           <w:sz w:val="16"/>
           <w:szCs w:val="16"/>
         </w:rPr>
-        <w:t>) → Transformer (</w:t>
-      </w:r>
-      <w:proofErr w:type="spellStart"/>
-      <w:r>
-        <w:rPr>
-          <w:rFonts w:ascii="Times New Roman" w:hAnsi="Times New Roman" w:cs="Times New Roman"/>
-          <w:sz w:val="16"/>
-          <w:szCs w:val="16"/>
-        </w:rPr>
-        <w:t>ViTPose</w:t>
-      </w:r>
-      <w:proofErr w:type="spellEnd"/>
-      <w:r>
-        <w:rPr>
-          <w:rFonts w:ascii="Times New Roman" w:hAnsi="Times New Roman" w:cs="Times New Roman"/>
-          <w:sz w:val="16"/>
-          <w:szCs w:val="16"/>
-        </w:rPr>
-        <w:t xml:space="preserve">, </w:t>
-      </w:r>
-      <w:proofErr w:type="spellStart"/>
-      <w:r>
-        <w:rPr>
-          <w:rFonts w:ascii="Times New Roman" w:hAnsi="Times New Roman" w:cs="Times New Roman"/>
-          <w:sz w:val="16"/>
-          <w:szCs w:val="16"/>
-        </w:rPr>
-        <w:t>PoseFormer</w:t>
-      </w:r>
-      <w:proofErr w:type="spellEnd"/>
-      <w:r>
-        <w:rPr>
-          <w:rFonts w:ascii="Times New Roman" w:hAnsi="Times New Roman" w:cs="Times New Roman"/>
-          <w:sz w:val="16"/>
-          <w:szCs w:val="16"/>
-        </w:rPr>
-        <w:t xml:space="preserve">) → </w:t>
-      </w:r>
-      <w:r>
-        <w:rPr>
-          <w:rFonts w:ascii="Times New Roman" w:hAnsi="Times New Roman" w:cs="Times New Roman"/>
-          <w:sz w:val="16"/>
-          <w:szCs w:val="16"/>
-        </w:rPr>
-        <w:t>大模型统一方法</w:t>
-      </w:r>
-      <w:r>
-        <w:rPr>
-          <w:rFonts w:ascii="Times New Roman" w:hAnsi="Times New Roman" w:cs="Times New Roman"/>
-          <w:sz w:val="16"/>
-          <w:szCs w:val="16"/>
-        </w:rPr>
-        <w:t xml:space="preserve"> (</w:t>
-      </w:r>
-      <w:proofErr w:type="spellStart"/>
-      <w:r>
-        <w:rPr>
-          <w:rFonts w:ascii="Times New Roman" w:hAnsi="Times New Roman" w:cs="Times New Roman"/>
-          <w:sz w:val="16"/>
-          <w:szCs w:val="16"/>
-        </w:rPr>
-        <w:t>UniPose</w:t>
-      </w:r>
-      <w:proofErr w:type="spellEnd"/>
-      <w:r>
-        <w:rPr>
-          <w:rFonts w:ascii="Times New Roman" w:hAnsi="Times New Roman" w:cs="Times New Roman"/>
-          <w:sz w:val="16"/>
-          <w:szCs w:val="16"/>
-        </w:rPr>
-        <w:t xml:space="preserve">, </w:t>
-      </w:r>
-      <w:proofErr w:type="spellStart"/>
-      <w:r>
-        <w:rPr>
-          <w:rFonts w:ascii="Times New Roman" w:hAnsi="Times New Roman" w:cs="Times New Roman"/>
-          <w:sz w:val="16"/>
-          <w:szCs w:val="16"/>
-        </w:rPr>
-        <w:t>RTMPose</w:t>
-      </w:r>
-      <w:proofErr w:type="spellEnd"/>
-      <w:r>
-        <w:rPr>
-          <w:rFonts w:ascii="Times New Roman" w:hAnsi="Times New Roman" w:cs="Times New Roman"/>
-          <w:sz w:val="16"/>
-          <w:szCs w:val="16"/>
-        </w:rPr>
-        <w:t xml:space="preserve">, GPT-4V + </w:t>
-      </w:r>
-      <w:proofErr w:type="spellStart"/>
-      <w:r>
-        <w:rPr>
-          <w:rFonts w:ascii="Times New Roman" w:hAnsi="Times New Roman" w:cs="Times New Roman"/>
-          <w:sz w:val="16"/>
-          <w:szCs w:val="16"/>
-        </w:rPr>
-        <w:t>MMPose</w:t>
-      </w:r>
-      <w:proofErr w:type="spellEnd"/>
+        <w:t xml:space="preserve"> (UniPose, RTMPose, GPT-4V + MMPose</w:t>
+      </w:r>
       <w:r>
         <w:rPr>
           <w:rFonts w:ascii="Times New Roman" w:hAnsi="Times New Roman" w:cs="Times New Roman" w:hint="eastAsia"/>
@@ -1145,27 +943,23 @@
           <w:sz w:val="16"/>
           <w:szCs w:val="16"/>
         </w:rPr>
-        <w:t>关键点定义 (</w:t>
-      </w:r>
-      <w:proofErr w:type="spellStart"/>
-      <w:r>
-        <w:rPr>
-          <w:b/>
-          <w:bCs/>
+        <w:t>关键点定义 (Keypoint Definition)</w:t>
+      </w:r>
+      <w:r>
+        <w:rPr>
           <w:sz w:val="16"/>
           <w:szCs w:val="16"/>
         </w:rPr>
-        <w:t>Keypoint</w:t>
-      </w:r>
-      <w:proofErr w:type="spellEnd"/>
-      <w:r>
-        <w:rPr>
-          <w:b/>
-          <w:bCs/>
+        <w:br/>
+        <w:t>器官中心点：花心、果实中心</w:t>
+      </w:r>
+      <w:r>
+        <w:rPr>
           <w:sz w:val="16"/>
           <w:szCs w:val="16"/>
         </w:rPr>
-        <w:t xml:space="preserve"> Definition)</w:t>
+        <w:br/>
+        <w:t>形态特征点：叶尖/叶基、花瓣尖端、果梗连接点</w:t>
       </w:r>
       <w:r>
         <w:rPr>
@@ -1173,23 +967,50 @@
           <w:szCs w:val="16"/>
         </w:rPr>
         <w:br/>
-        <w:t>器官中心点：花心、果实中心</w:t>
-      </w:r>
-      <w:r>
+        <w:t>结构连接点：分枝点、叶柄连接点</w:t>
+      </w:r>
+    </w:p>
+    <w:p>
+      <w:pPr>
+        <w:pStyle w:val="af3"/>
+        <w:ind w:left="440"/>
         <w:rPr>
           <w:sz w:val="16"/>
           <w:szCs w:val="16"/>
         </w:rPr>
-        <w:br/>
-        <w:t>形态特征点：叶尖/叶基、花瓣尖端、果梗连接点</w:t>
-      </w:r>
-      <w:r>
-        <w:rPr>
+      </w:pPr>
+      <w:r>
+        <w:rPr>
+          <w:b/>
+          <w:bCs/>
           <w:sz w:val="16"/>
           <w:szCs w:val="16"/>
         </w:rPr>
+        <w:t>检测方法 (Detection Methods)</w:t>
+      </w:r>
+      <w:r>
+        <w:rPr>
+          <w:sz w:val="16"/>
+          <w:szCs w:val="16"/>
+        </w:rPr>
         <w:br/>
-        <w:t>结构连接点：分枝点、叶柄连接点</w:t>
+        <w:t>传统计算机视觉：SIFT、SURF、ORB</w:t>
+      </w:r>
+      <w:r>
+        <w:rPr>
+          <w:sz w:val="16"/>
+          <w:szCs w:val="16"/>
+        </w:rPr>
+        <w:br/>
+        <w:t>基于深度学习：热图回归、直接坐标回归</w:t>
+      </w:r>
+      <w:r>
+        <w:rPr>
+          <w:sz w:val="16"/>
+          <w:szCs w:val="16"/>
+        </w:rPr>
+        <w:br/>
+        <w:t>常用架构：R-CNN 系列、YOLO 系列、Transformer-based</w:t>
       </w:r>
     </w:p>
     <w:p>
@@ -1208,15 +1029,14 @@
           <w:sz w:val="16"/>
           <w:szCs w:val="16"/>
         </w:rPr>
-        <w:t>检测方法 (Detection Methods)</w:t>
+        <w:t>挑战 (Challenges)</w:t>
       </w:r>
       <w:r>
         <w:rPr>
           <w:sz w:val="16"/>
           <w:szCs w:val="16"/>
         </w:rPr>
-        <w:br/>
-        <w:t>传统计算机视觉：SIFT、SURF、ORB</w:t>
+        <w:t xml:space="preserve"> ::icon(fa fa-exclamation-triangle)</w:t>
       </w:r>
       <w:r>
         <w:rPr>
@@ -1224,100 +1044,776 @@
           <w:szCs w:val="16"/>
         </w:rPr>
         <w:br/>
-        <w:t>基于深度学习：</w:t>
-      </w:r>
-      <w:proofErr w:type="gramStart"/>
-      <w:r>
+        <w:t>遮挡问题、光照与环境变化、形态多样性与变形、数据获取与标注成本</w:t>
+      </w:r>
+    </w:p>
+    <w:p>
+      <w:pPr>
+        <w:pStyle w:val="af3"/>
+        <w:ind w:left="440"/>
         <w:rPr>
           <w:sz w:val="16"/>
           <w:szCs w:val="16"/>
         </w:rPr>
-        <w:t>热图回归</w:t>
-      </w:r>
-      <w:proofErr w:type="gramEnd"/>
-      <w:r>
-        <w:rPr>
+      </w:pPr>
+      <w:r>
+        <w:rPr>
+          <w:b/>
+          <w:bCs/>
           <w:sz w:val="16"/>
           <w:szCs w:val="16"/>
         </w:rPr>
-        <w:t>、直接坐标回归</w:t>
+        <w:t>未来趋势 (Future Trends)</w:t>
       </w:r>
       <w:r>
         <w:rPr>
           <w:sz w:val="16"/>
           <w:szCs w:val="16"/>
         </w:rPr>
-        <w:br/>
-        <w:t>常用架构：R-CNN 系列、YOLO 系列、Transformer-based</w:t>
-      </w:r>
-    </w:p>
-    <w:p>
-      <w:pPr>
-        <w:pStyle w:val="af3"/>
-        <w:ind w:left="440"/>
+        <w:t xml:space="preserve"> ::icon(fa fa-rocket)</w:t>
+      </w:r>
+      <w:r>
         <w:rPr>
           <w:sz w:val="16"/>
           <w:szCs w:val="16"/>
         </w:rPr>
-      </w:pPr>
-      <w:r>
-        <w:rPr>
-          <w:b/>
-          <w:bCs/>
+        <w:br/>
+        <w:t>3D 关键点检测、多模态数据融合、轻量化模型与边缘计算、无/弱监督学习、Foundation Models 应用</w:t>
+      </w:r>
+    </w:p>
+    <w:p>
+      <w:pPr>
+        <w:spacing w:line="360" w:lineRule="auto"/>
+        <w:outlineLvl w:val="0"/>
+        <w:rPr>
+          <w:rFonts w:ascii="Times New Roman" w:eastAsia="宋体" w:hAnsi="Times New Roman" w:cs="Times New Roman"/>
+          <w:b/>
+          <w:bCs/>
+        </w:rPr>
+      </w:pPr>
+      <w:r>
+        <w:rPr>
+          <w:rFonts w:ascii="Times New Roman" w:eastAsia="宋体" w:hAnsi="Times New Roman" w:cs="Times New Roman" w:hint="eastAsia"/>
+          <w:b/>
+          <w:bCs/>
+        </w:rPr>
+        <w:t xml:space="preserve">2. </w:t>
+      </w:r>
+      <w:r>
+        <w:rPr>
+          <w:rFonts w:ascii="Times New Roman" w:eastAsia="宋体" w:hAnsi="Times New Roman" w:cs="Times New Roman"/>
+          <w:b/>
+          <w:bCs/>
+        </w:rPr>
+        <w:t>Related work</w:t>
+      </w:r>
+      <w:r>
+        <w:rPr>
+          <w:rFonts w:ascii="Times New Roman" w:eastAsia="宋体" w:hAnsi="Times New Roman" w:cs="Times New Roman"/>
+          <w:b/>
+          <w:bCs/>
+        </w:rPr>
+        <w:t xml:space="preserve"> for </w:t>
+      </w:r>
+      <w:r>
+        <w:rPr>
+          <w:rFonts w:ascii="Times New Roman" w:eastAsia="宋体" w:hAnsi="Times New Roman" w:cs="Times New Roman"/>
+          <w:b/>
+          <w:bCs/>
+        </w:rPr>
+        <w:t>keypoint detection</w:t>
+      </w:r>
+    </w:p>
+    <w:p>
+      <w:pPr>
+        <w:pStyle w:val="af3"/>
+        <w:outlineLvl w:val="1"/>
+        <w:rPr>
+          <w:rFonts w:ascii="Times New Roman" w:hAnsi="Times New Roman" w:cs="Times New Roman"/>
+          <w:sz w:val="20"/>
+          <w:szCs w:val="20"/>
+        </w:rPr>
+      </w:pPr>
+      <w:r>
+        <w:rPr>
+          <w:rFonts w:ascii="Times New Roman" w:hAnsi="Times New Roman" w:cs="Times New Roman" w:hint="eastAsia"/>
+          <w:sz w:val="20"/>
+          <w:szCs w:val="20"/>
+        </w:rPr>
+        <w:t xml:space="preserve">2.1 </w:t>
+      </w:r>
+      <w:r>
+        <w:rPr>
+          <w:rFonts w:ascii="Times New Roman" w:hAnsi="Times New Roman" w:cs="Times New Roman"/>
+          <w:sz w:val="20"/>
+          <w:szCs w:val="20"/>
+        </w:rPr>
+        <w:t xml:space="preserve">Keypoint </w:t>
+      </w:r>
+      <w:r>
+        <w:rPr>
+          <w:rFonts w:ascii="Times New Roman" w:hAnsi="Times New Roman" w:cs="Times New Roman"/>
+          <w:sz w:val="20"/>
+          <w:szCs w:val="20"/>
+        </w:rPr>
+        <w:t>representation</w:t>
+      </w:r>
+    </w:p>
+    <w:p>
+      <w:pPr>
+        <w:pStyle w:val="af3"/>
+        <w:outlineLvl w:val="1"/>
+        <w:rPr>
+          <w:rFonts w:ascii="Times New Roman" w:hAnsi="Times New Roman" w:cs="Times New Roman"/>
+          <w:sz w:val="20"/>
+          <w:szCs w:val="20"/>
+        </w:rPr>
+      </w:pPr>
+      <w:r>
+        <w:rPr>
+          <w:rFonts w:ascii="Times New Roman" w:hAnsi="Times New Roman" w:cs="Times New Roman" w:hint="eastAsia"/>
+          <w:sz w:val="20"/>
+          <w:szCs w:val="20"/>
+        </w:rPr>
+        <w:t>2.</w:t>
+      </w:r>
+      <w:r>
+        <w:rPr>
+          <w:rFonts w:ascii="Times New Roman" w:hAnsi="Times New Roman" w:cs="Times New Roman" w:hint="eastAsia"/>
+          <w:sz w:val="20"/>
+          <w:szCs w:val="20"/>
+        </w:rPr>
+        <w:t>2</w:t>
+      </w:r>
+      <w:r>
+        <w:rPr>
+          <w:rFonts w:ascii="Times New Roman" w:hAnsi="Times New Roman" w:cs="Times New Roman" w:hint="eastAsia"/>
+          <w:sz w:val="20"/>
+          <w:szCs w:val="20"/>
+        </w:rPr>
+        <w:t xml:space="preserve"> </w:t>
+      </w:r>
+      <w:r>
+        <w:rPr>
+          <w:rFonts w:ascii="Times New Roman" w:hAnsi="Times New Roman" w:cs="Times New Roman"/>
+          <w:sz w:val="20"/>
+          <w:szCs w:val="20"/>
+        </w:rPr>
+        <w:t xml:space="preserve">Keypoint feature </w:t>
+      </w:r>
+      <w:r>
+        <w:rPr>
+          <w:rFonts w:ascii="Times New Roman" w:hAnsi="Times New Roman" w:cs="Times New Roman" w:hint="eastAsia"/>
+          <w:sz w:val="20"/>
+          <w:szCs w:val="20"/>
+        </w:rPr>
+        <w:t>engineering</w:t>
+      </w:r>
+    </w:p>
+    <w:p>
+      <w:pPr>
+        <w:pStyle w:val="af3"/>
+        <w:outlineLvl w:val="1"/>
+        <w:rPr>
+          <w:rFonts w:ascii="Times New Roman" w:hAnsi="Times New Roman" w:cs="Times New Roman"/>
+          <w:sz w:val="20"/>
+          <w:szCs w:val="20"/>
+        </w:rPr>
+      </w:pPr>
+      <w:r>
+        <w:rPr>
+          <w:rFonts w:ascii="Times New Roman" w:hAnsi="Times New Roman" w:cs="Times New Roman" w:hint="eastAsia"/>
+          <w:sz w:val="20"/>
+          <w:szCs w:val="20"/>
+        </w:rPr>
+        <w:lastRenderedPageBreak/>
+        <w:t>2.</w:t>
+      </w:r>
+      <w:r>
+        <w:rPr>
+          <w:rFonts w:ascii="Times New Roman" w:hAnsi="Times New Roman" w:cs="Times New Roman" w:hint="eastAsia"/>
+          <w:sz w:val="20"/>
+          <w:szCs w:val="20"/>
+        </w:rPr>
+        <w:t>3</w:t>
+      </w:r>
+      <w:r>
+        <w:rPr>
+          <w:rFonts w:ascii="Times New Roman" w:hAnsi="Times New Roman" w:cs="Times New Roman" w:hint="eastAsia"/>
+          <w:sz w:val="20"/>
+          <w:szCs w:val="20"/>
+        </w:rPr>
+        <w:t xml:space="preserve"> </w:t>
+      </w:r>
+      <w:r>
+        <w:rPr>
+          <w:rFonts w:ascii="Times New Roman" w:hAnsi="Times New Roman" w:cs="Times New Roman"/>
+          <w:sz w:val="20"/>
+          <w:szCs w:val="20"/>
+        </w:rPr>
+        <w:t>C</w:t>
+      </w:r>
+      <w:r>
+        <w:rPr>
+          <w:rFonts w:ascii="Times New Roman" w:hAnsi="Times New Roman" w:cs="Times New Roman"/>
+          <w:sz w:val="20"/>
+          <w:szCs w:val="20"/>
+        </w:rPr>
+        <w:t>omputer vision tasks</w:t>
+      </w:r>
+      <w:r>
+        <w:rPr>
+          <w:rFonts w:ascii="Times New Roman" w:hAnsi="Times New Roman" w:cs="Times New Roman"/>
+          <w:sz w:val="20"/>
+          <w:szCs w:val="20"/>
+        </w:rPr>
+        <w:t xml:space="preserve"> based on keypoint</w:t>
+      </w:r>
+    </w:p>
+    <w:p>
+      <w:pPr>
+        <w:pStyle w:val="af3"/>
+        <w:outlineLvl w:val="1"/>
+        <w:rPr>
+          <w:rFonts w:ascii="Times New Roman" w:hAnsi="Times New Roman" w:cs="Times New Roman"/>
+          <w:sz w:val="20"/>
+          <w:szCs w:val="20"/>
+        </w:rPr>
+      </w:pPr>
+      <w:r>
+        <w:rPr>
+          <w:rFonts w:ascii="Times New Roman" w:hAnsi="Times New Roman" w:cs="Times New Roman" w:hint="eastAsia"/>
+          <w:sz w:val="20"/>
+          <w:szCs w:val="20"/>
+        </w:rPr>
+        <w:t>2.</w:t>
+      </w:r>
+      <w:r>
+        <w:rPr>
+          <w:rFonts w:ascii="Times New Roman" w:hAnsi="Times New Roman" w:cs="Times New Roman" w:hint="eastAsia"/>
+          <w:sz w:val="20"/>
+          <w:szCs w:val="20"/>
+        </w:rPr>
+        <w:t>4</w:t>
+      </w:r>
+      <w:r>
+        <w:rPr>
+          <w:rFonts w:ascii="Times New Roman" w:hAnsi="Times New Roman" w:cs="Times New Roman" w:hint="eastAsia"/>
+          <w:sz w:val="20"/>
+          <w:szCs w:val="20"/>
+        </w:rPr>
+        <w:t xml:space="preserve"> </w:t>
+      </w:r>
+      <w:r>
+        <w:rPr>
+          <w:rFonts w:ascii="Times New Roman" w:hAnsi="Times New Roman" w:cs="Times New Roman" w:hint="eastAsia"/>
+          <w:sz w:val="20"/>
+          <w:szCs w:val="20"/>
+        </w:rPr>
+        <w:t>Different technology</w:t>
+      </w:r>
+      <w:r>
+        <w:rPr>
+          <w:rFonts w:ascii="Times New Roman" w:hAnsi="Times New Roman" w:cs="Times New Roman"/>
+          <w:sz w:val="20"/>
+          <w:szCs w:val="20"/>
+        </w:rPr>
+        <w:t xml:space="preserve"> based on keypoint</w:t>
+      </w:r>
+    </w:p>
+    <w:p>
+      <w:pPr>
+        <w:pStyle w:val="af3"/>
+        <w:rPr>
+          <w:rFonts w:ascii="Times New Roman" w:hAnsi="Times New Roman" w:cs="Times New Roman"/>
+          <w:b/>
+          <w:bCs/>
+          <w:sz w:val="20"/>
+          <w:szCs w:val="20"/>
+        </w:rPr>
+      </w:pPr>
+      <w:r>
+        <w:rPr>
+          <w:rFonts w:ascii="Times New Roman" w:hAnsi="Times New Roman" w:cs="Times New Roman"/>
+          <w:b/>
+          <w:bCs/>
+          <w:sz w:val="20"/>
+          <w:szCs w:val="20"/>
+        </w:rPr>
+        <w:t xml:space="preserve">1. </w:t>
+      </w:r>
+      <w:r>
+        <w:rPr>
+          <w:rFonts w:ascii="Times New Roman" w:hAnsi="Times New Roman" w:cs="Times New Roman"/>
+          <w:b/>
+          <w:bCs/>
+          <w:sz w:val="20"/>
+          <w:szCs w:val="20"/>
+        </w:rPr>
+        <w:t>端到端关键点检测方法（</w:t>
+      </w:r>
+      <w:r>
+        <w:rPr>
+          <w:rFonts w:ascii="Times New Roman" w:hAnsi="Times New Roman" w:cs="Times New Roman"/>
+          <w:b/>
+          <w:bCs/>
+          <w:sz w:val="20"/>
+          <w:szCs w:val="20"/>
+        </w:rPr>
+        <w:t>2D/3D</w:t>
+      </w:r>
+      <w:r>
+        <w:rPr>
+          <w:rFonts w:ascii="Times New Roman" w:hAnsi="Times New Roman" w:cs="Times New Roman"/>
+          <w:b/>
+          <w:bCs/>
+          <w:sz w:val="20"/>
+          <w:szCs w:val="20"/>
+        </w:rPr>
+        <w:t>）</w:t>
+      </w:r>
+    </w:p>
+    <w:p>
+      <w:pPr>
+        <w:pStyle w:val="af3"/>
+        <w:rPr>
+          <w:rFonts w:ascii="Times New Roman" w:hAnsi="Times New Roman" w:cs="Times New Roman"/>
+          <w:sz w:val="20"/>
+          <w:szCs w:val="20"/>
+        </w:rPr>
+      </w:pPr>
+      <w:r>
+        <w:rPr>
+          <w:rFonts w:ascii="Times New Roman" w:hAnsi="Times New Roman" w:cs="Times New Roman"/>
+          <w:sz w:val="20"/>
+          <w:szCs w:val="20"/>
+        </w:rPr>
+        <w:t>如</w:t>
+      </w:r>
+      <w:r>
+        <w:rPr>
+          <w:rFonts w:ascii="Times New Roman" w:hAnsi="Times New Roman" w:cs="Times New Roman"/>
+          <w:sz w:val="20"/>
+          <w:szCs w:val="20"/>
+        </w:rPr>
+        <w:t xml:space="preserve"> HRNet, MMPose, CenterNet, Keypoint R-CNN, YOLO-Pose </w:t>
+      </w:r>
+      <w:r>
+        <w:rPr>
+          <w:rFonts w:ascii="Times New Roman" w:hAnsi="Times New Roman" w:cs="Times New Roman"/>
+          <w:sz w:val="20"/>
+          <w:szCs w:val="20"/>
+        </w:rPr>
+        <w:t>等在植物上的应用。</w:t>
+      </w:r>
+    </w:p>
+    <w:p>
+      <w:pPr>
+        <w:pStyle w:val="af3"/>
+        <w:rPr>
+          <w:rFonts w:ascii="Times New Roman" w:hAnsi="Times New Roman" w:cs="Times New Roman"/>
+          <w:b/>
+          <w:bCs/>
+          <w:sz w:val="20"/>
+          <w:szCs w:val="20"/>
+        </w:rPr>
+      </w:pPr>
+      <w:r>
+        <w:rPr>
+          <w:rFonts w:ascii="Times New Roman" w:hAnsi="Times New Roman" w:cs="Times New Roman"/>
+          <w:b/>
+          <w:bCs/>
+          <w:sz w:val="20"/>
+          <w:szCs w:val="20"/>
+        </w:rPr>
+        <w:t xml:space="preserve">2. </w:t>
+      </w:r>
+      <w:r>
+        <w:rPr>
+          <w:rFonts w:ascii="Times New Roman" w:hAnsi="Times New Roman" w:cs="Times New Roman"/>
+          <w:b/>
+          <w:bCs/>
+          <w:sz w:val="20"/>
+          <w:szCs w:val="20"/>
+        </w:rPr>
+        <w:t>基于姿态</w:t>
+      </w:r>
+      <w:r>
+        <w:rPr>
+          <w:rFonts w:ascii="Times New Roman" w:hAnsi="Times New Roman" w:cs="Times New Roman"/>
+          <w:b/>
+          <w:bCs/>
+          <w:sz w:val="20"/>
+          <w:szCs w:val="20"/>
+        </w:rPr>
+        <w:t>/</w:t>
+      </w:r>
+      <w:r>
+        <w:rPr>
+          <w:rFonts w:ascii="Times New Roman" w:hAnsi="Times New Roman" w:cs="Times New Roman"/>
+          <w:b/>
+          <w:bCs/>
+          <w:sz w:val="20"/>
+          <w:szCs w:val="20"/>
+        </w:rPr>
+        <w:t>骨架的关键点检测（在植物表型学中的改编）</w:t>
+      </w:r>
+    </w:p>
+    <w:p>
+      <w:pPr>
+        <w:pStyle w:val="af3"/>
+        <w:rPr>
+          <w:rFonts w:ascii="Times New Roman" w:hAnsi="Times New Roman" w:cs="Times New Roman"/>
+          <w:b/>
+          <w:bCs/>
+          <w:sz w:val="20"/>
+          <w:szCs w:val="20"/>
+        </w:rPr>
+      </w:pPr>
+      <w:r>
+        <w:rPr>
+          <w:rFonts w:ascii="Times New Roman" w:hAnsi="Times New Roman" w:cs="Times New Roman"/>
+          <w:b/>
+          <w:bCs/>
+          <w:sz w:val="20"/>
+          <w:szCs w:val="20"/>
+        </w:rPr>
+        <w:t xml:space="preserve">3. </w:t>
+      </w:r>
+      <w:r>
+        <w:rPr>
+          <w:rFonts w:ascii="Times New Roman" w:hAnsi="Times New Roman" w:cs="Times New Roman"/>
+          <w:b/>
+          <w:bCs/>
+          <w:sz w:val="20"/>
+          <w:szCs w:val="20"/>
+        </w:rPr>
+        <w:t>非端到端方法（包含你提到的这些）</w:t>
+      </w:r>
+    </w:p>
+    <w:p>
+      <w:pPr>
+        <w:pStyle w:val="af3"/>
+        <w:rPr>
+          <w:rFonts w:ascii="Times New Roman" w:hAnsi="Times New Roman" w:cs="Times New Roman"/>
+          <w:b/>
+          <w:bCs/>
+          <w:sz w:val="20"/>
+          <w:szCs w:val="20"/>
+        </w:rPr>
+      </w:pPr>
+      <w:r>
+        <w:rPr>
+          <w:rFonts w:ascii="Times New Roman" w:hAnsi="Times New Roman" w:cs="Times New Roman"/>
+          <w:b/>
+          <w:bCs/>
+          <w:sz w:val="20"/>
+          <w:szCs w:val="20"/>
+        </w:rPr>
+        <w:t xml:space="preserve">3.1 </w:t>
+      </w:r>
+      <w:r>
+        <w:rPr>
+          <w:rFonts w:ascii="Times New Roman" w:hAnsi="Times New Roman" w:cs="Times New Roman"/>
+          <w:b/>
+          <w:bCs/>
+          <w:sz w:val="20"/>
+          <w:szCs w:val="20"/>
+        </w:rPr>
+        <w:t>检测</w:t>
+      </w:r>
+      <w:r>
+        <w:rPr>
+          <w:rFonts w:ascii="Times New Roman" w:hAnsi="Times New Roman" w:cs="Times New Roman"/>
+          <w:b/>
+          <w:bCs/>
+          <w:sz w:val="20"/>
+          <w:szCs w:val="20"/>
+        </w:rPr>
+        <w:t>/</w:t>
+      </w:r>
+      <w:r>
+        <w:rPr>
+          <w:rFonts w:ascii="Times New Roman" w:hAnsi="Times New Roman" w:cs="Times New Roman"/>
+          <w:b/>
+          <w:bCs/>
+          <w:sz w:val="20"/>
+          <w:szCs w:val="20"/>
+        </w:rPr>
+        <w:t>分割</w:t>
+      </w:r>
+      <w:r>
+        <w:rPr>
+          <w:rFonts w:ascii="Times New Roman" w:hAnsi="Times New Roman" w:cs="Times New Roman"/>
+          <w:b/>
+          <w:bCs/>
+          <w:sz w:val="20"/>
+          <w:szCs w:val="20"/>
+        </w:rPr>
+        <w:t xml:space="preserve"> → </w:t>
+      </w:r>
+      <w:r>
+        <w:rPr>
+          <w:rFonts w:ascii="Times New Roman" w:hAnsi="Times New Roman" w:cs="Times New Roman"/>
+          <w:b/>
+          <w:bCs/>
+          <w:sz w:val="20"/>
+          <w:szCs w:val="20"/>
+        </w:rPr>
+        <w:t>点云重建</w:t>
+      </w:r>
+      <w:r>
+        <w:rPr>
+          <w:rFonts w:ascii="Times New Roman" w:hAnsi="Times New Roman" w:cs="Times New Roman"/>
+          <w:b/>
+          <w:bCs/>
+          <w:sz w:val="20"/>
+          <w:szCs w:val="20"/>
+        </w:rPr>
+        <w:t xml:space="preserve"> → </w:t>
+      </w:r>
+      <w:r>
+        <w:rPr>
+          <w:rFonts w:ascii="Times New Roman" w:hAnsi="Times New Roman" w:cs="Times New Roman"/>
+          <w:b/>
+          <w:bCs/>
+          <w:sz w:val="20"/>
+          <w:szCs w:val="20"/>
+        </w:rPr>
+        <w:t>传统几何算法找关键点</w:t>
+      </w:r>
+    </w:p>
+    <w:p>
+      <w:pPr>
+        <w:pStyle w:val="af3"/>
+        <w:numPr>
+          <w:ilvl w:val="0"/>
+          <w:numId w:val="17"/>
+        </w:numPr>
+        <w:rPr>
+          <w:rFonts w:ascii="Times New Roman" w:hAnsi="Times New Roman" w:cs="Times New Roman"/>
+          <w:sz w:val="20"/>
+          <w:szCs w:val="20"/>
+        </w:rPr>
+      </w:pPr>
+      <w:r>
+        <w:rPr>
+          <w:rFonts w:ascii="Times New Roman" w:hAnsi="Times New Roman" w:cs="Times New Roman"/>
+          <w:sz w:val="20"/>
+          <w:szCs w:val="20"/>
+        </w:rPr>
+        <w:t>深度学习只负责前段的数据质量（如目标检测、语义分割、深度估计）</w:t>
+      </w:r>
+    </w:p>
+    <w:p>
+      <w:pPr>
+        <w:pStyle w:val="af3"/>
+        <w:numPr>
+          <w:ilvl w:val="0"/>
+          <w:numId w:val="17"/>
+        </w:numPr>
+        <w:rPr>
+          <w:rFonts w:ascii="Times New Roman" w:hAnsi="Times New Roman" w:cs="Times New Roman"/>
+          <w:sz w:val="20"/>
+          <w:szCs w:val="20"/>
+        </w:rPr>
+      </w:pPr>
+      <w:r>
+        <w:rPr>
+          <w:rFonts w:ascii="Times New Roman" w:hAnsi="Times New Roman" w:cs="Times New Roman"/>
+          <w:sz w:val="20"/>
+          <w:szCs w:val="20"/>
+        </w:rPr>
+        <w:t>关键点由传统算法完成（如</w:t>
+      </w:r>
+      <w:r>
+        <w:rPr>
+          <w:rFonts w:ascii="Times New Roman" w:hAnsi="Times New Roman" w:cs="Times New Roman"/>
+          <w:sz w:val="20"/>
+          <w:szCs w:val="20"/>
+        </w:rPr>
+        <w:t xml:space="preserve"> RANSAC</w:t>
+      </w:r>
+      <w:r>
+        <w:rPr>
+          <w:rFonts w:ascii="Times New Roman" w:hAnsi="Times New Roman" w:cs="Times New Roman"/>
+          <w:sz w:val="20"/>
+          <w:szCs w:val="20"/>
+        </w:rPr>
+        <w:t>、</w:t>
+      </w:r>
+      <w:r>
+        <w:rPr>
+          <w:rFonts w:ascii="Times New Roman" w:hAnsi="Times New Roman" w:cs="Times New Roman"/>
+          <w:sz w:val="20"/>
+          <w:szCs w:val="20"/>
+        </w:rPr>
+        <w:t>ISS</w:t>
+      </w:r>
+      <w:r>
+        <w:rPr>
+          <w:rFonts w:ascii="Times New Roman" w:hAnsi="Times New Roman" w:cs="Times New Roman"/>
+          <w:sz w:val="20"/>
+          <w:szCs w:val="20"/>
+        </w:rPr>
+        <w:t>、</w:t>
+      </w:r>
+      <w:r>
+        <w:rPr>
+          <w:rFonts w:ascii="Times New Roman" w:hAnsi="Times New Roman" w:cs="Times New Roman"/>
+          <w:sz w:val="20"/>
+          <w:szCs w:val="20"/>
+        </w:rPr>
+        <w:t>Harris3D</w:t>
+      </w:r>
+      <w:r>
+        <w:rPr>
+          <w:rFonts w:ascii="Times New Roman" w:hAnsi="Times New Roman" w:cs="Times New Roman"/>
+          <w:sz w:val="20"/>
+          <w:szCs w:val="20"/>
+        </w:rPr>
+        <w:t>、曲率分析等）</w:t>
+      </w:r>
+    </w:p>
+    <w:p>
+      <w:pPr>
+        <w:pStyle w:val="af3"/>
+        <w:rPr>
+          <w:rFonts w:ascii="Times New Roman" w:hAnsi="Times New Roman" w:cs="Times New Roman"/>
+          <w:b/>
+          <w:bCs/>
+          <w:sz w:val="20"/>
+          <w:szCs w:val="20"/>
+        </w:rPr>
+      </w:pPr>
+      <w:r>
+        <w:rPr>
+          <w:rFonts w:ascii="Times New Roman" w:hAnsi="Times New Roman" w:cs="Times New Roman"/>
+          <w:b/>
+          <w:bCs/>
+          <w:sz w:val="20"/>
+          <w:szCs w:val="20"/>
+        </w:rPr>
+        <w:t xml:space="preserve">3.2 </w:t>
+      </w:r>
+      <w:r>
+        <w:rPr>
+          <w:rFonts w:ascii="Times New Roman" w:hAnsi="Times New Roman" w:cs="Times New Roman"/>
+          <w:b/>
+          <w:bCs/>
+          <w:i/>
+          <w:iCs/>
+          <w:sz w:val="20"/>
+          <w:szCs w:val="20"/>
+        </w:rPr>
+        <w:t>基于结构规则或植物几何特性的关键点定义</w:t>
+      </w:r>
+    </w:p>
+    <w:p>
+      <w:pPr>
+        <w:pStyle w:val="af3"/>
+        <w:rPr>
+          <w:rFonts w:ascii="Times New Roman" w:hAnsi="Times New Roman" w:cs="Times New Roman"/>
+          <w:b/>
+          <w:bCs/>
+          <w:sz w:val="20"/>
+          <w:szCs w:val="20"/>
+        </w:rPr>
+      </w:pPr>
+      <w:r>
+        <w:rPr>
+          <w:rFonts w:ascii="Times New Roman" w:hAnsi="Times New Roman" w:cs="Times New Roman"/>
+          <w:b/>
+          <w:bCs/>
+          <w:sz w:val="20"/>
+          <w:szCs w:val="20"/>
+        </w:rPr>
+        <w:t xml:space="preserve">4. </w:t>
+      </w:r>
+      <w:r>
+        <w:rPr>
+          <w:rFonts w:ascii="Times New Roman" w:hAnsi="Times New Roman" w:cs="Times New Roman"/>
+          <w:b/>
+          <w:bCs/>
+          <w:sz w:val="20"/>
+          <w:szCs w:val="20"/>
+        </w:rPr>
+        <w:t>混合式方法（</w:t>
+      </w:r>
+      <w:r>
+        <w:rPr>
+          <w:rFonts w:ascii="Times New Roman" w:hAnsi="Times New Roman" w:cs="Times New Roman"/>
+          <w:b/>
+          <w:bCs/>
+          <w:sz w:val="20"/>
+          <w:szCs w:val="20"/>
+        </w:rPr>
+        <w:t>DL + Geometry</w:t>
+      </w:r>
+      <w:r>
+        <w:rPr>
+          <w:rFonts w:ascii="Times New Roman" w:hAnsi="Times New Roman" w:cs="Times New Roman"/>
+          <w:b/>
+          <w:bCs/>
+          <w:sz w:val="20"/>
+          <w:szCs w:val="20"/>
+        </w:rPr>
+        <w:t>）</w:t>
+      </w:r>
+    </w:p>
+    <w:p>
+      <w:pPr>
+        <w:pStyle w:val="af3"/>
+        <w:rPr>
+          <w:rFonts w:ascii="Times New Roman" w:hAnsi="Times New Roman" w:cs="Times New Roman"/>
+          <w:sz w:val="20"/>
+          <w:szCs w:val="20"/>
+        </w:rPr>
+      </w:pPr>
+      <w:r>
+        <w:rPr>
+          <w:rFonts w:ascii="Times New Roman" w:hAnsi="Times New Roman" w:cs="Times New Roman"/>
+          <w:sz w:val="20"/>
+          <w:szCs w:val="20"/>
+        </w:rPr>
+        <w:t>这类方法既有</w:t>
+      </w:r>
+      <w:r>
+        <w:rPr>
+          <w:rFonts w:ascii="Times New Roman" w:hAnsi="Times New Roman" w:cs="Times New Roman"/>
+          <w:sz w:val="20"/>
+          <w:szCs w:val="20"/>
+        </w:rPr>
+        <w:t xml:space="preserve"> DL </w:t>
+      </w:r>
+      <w:r>
+        <w:rPr>
+          <w:rFonts w:ascii="Times New Roman" w:hAnsi="Times New Roman" w:cs="Times New Roman"/>
+          <w:sz w:val="20"/>
+          <w:szCs w:val="20"/>
+        </w:rPr>
+        <w:t>的学习能力，也利用植物结构的几何约束。</w:t>
+      </w:r>
+    </w:p>
+    <w:p>
+      <w:pPr>
+        <w:pStyle w:val="af3"/>
+        <w:rPr>
+          <w:rFonts w:ascii="Times New Roman" w:hAnsi="Times New Roman" w:cs="Times New Roman"/>
+          <w:sz w:val="20"/>
+          <w:szCs w:val="20"/>
+        </w:rPr>
+      </w:pPr>
+    </w:p>
+    <w:p>
+      <w:pPr>
+        <w:pStyle w:val="af3"/>
+        <w:rPr>
+          <w:rFonts w:hint="eastAsia"/>
           <w:sz w:val="16"/>
           <w:szCs w:val="16"/>
         </w:rPr>
-        <w:t>挑战 (Challenges)</w:t>
-      </w:r>
-      <w:r>
-        <w:rPr>
-          <w:sz w:val="16"/>
-          <w:szCs w:val="16"/>
-        </w:rPr>
-        <w:t xml:space="preserve"> ::icon(fa fa-exclamation-triangle)</w:t>
-      </w:r>
-      <w:r>
-        <w:rPr>
-          <w:sz w:val="16"/>
-          <w:szCs w:val="16"/>
-        </w:rPr>
-        <w:br/>
-        <w:t>遮挡问题、光照与环境变化、形态多样性与变形、数据获取与标注成本</w:t>
-      </w:r>
-    </w:p>
-    <w:p>
-      <w:pPr>
-        <w:pStyle w:val="af3"/>
-        <w:ind w:left="440"/>
-        <w:rPr>
-          <w:sz w:val="16"/>
-          <w:szCs w:val="16"/>
-        </w:rPr>
-      </w:pPr>
-      <w:r>
-        <w:rPr>
-          <w:b/>
-          <w:bCs/>
-          <w:sz w:val="16"/>
-          <w:szCs w:val="16"/>
-        </w:rPr>
-        <w:t>未来趋势 (Future Trends)</w:t>
-      </w:r>
-      <w:r>
-        <w:rPr>
-          <w:sz w:val="16"/>
-          <w:szCs w:val="16"/>
-        </w:rPr>
-        <w:t xml:space="preserve"> ::icon(fa fa-rocket)</w:t>
-      </w:r>
-      <w:r>
-        <w:rPr>
-          <w:sz w:val="16"/>
-          <w:szCs w:val="16"/>
-        </w:rPr>
-        <w:br/>
-        <w:t>3D 关键点检测、多模态数据融合、轻量化模型与边缘计算、无/弱监督学习、Foundation Models 应用</w:t>
-      </w:r>
+      </w:pPr>
     </w:p>
     <w:p>
       <w:pPr>
@@ -1378,14 +1874,7 @@
         <w:rPr>
           <w:rFonts w:ascii="Times New Roman" w:eastAsia="宋体" w:hAnsi="Times New Roman" w:cs="Times New Roman"/>
         </w:rPr>
-        <w:t xml:space="preserve"> These RQs provided the foundation </w:t>
-      </w:r>
-      <w:r>
-        <w:rPr>
-          <w:rFonts w:ascii="Times New Roman" w:eastAsia="宋体" w:hAnsi="Times New Roman" w:cs="Times New Roman"/>
-        </w:rPr>
-        <w:lastRenderedPageBreak/>
-        <w:t>for our systematic literature review (SLR) and facilitated the collection of pertinent publications.</w:t>
+        <w:t xml:space="preserve"> These RQs provided the foundation for our systematic literature review (SLR) and facilitated the collection of pertinent publications.</w:t>
       </w:r>
       <w:bookmarkStart w:id="0" w:name="OLE_LINK2"/>
     </w:p>
@@ -1530,7 +2019,14 @@
         <w:rPr>
           <w:rFonts w:ascii="Times New Roman" w:eastAsia="宋体" w:hAnsi="Times New Roman" w:cs="Times New Roman"/>
         </w:rPr>
-        <w:t xml:space="preserve"> SLR, the selection process must follow a rigorous and unbiased search strategy aimed at bringing together the broadest possible range of original studies that provide a solid evidence base to directly answer the posed RQs. Therefore, building upon effective methodologies identified in previous studies, the search and analysis process was meticulously designed to comprehensively incorporate all published research results. To ensure both comprehensiveness and depth, our literature search and analysis followed a structured three-stage approach.</w:t>
+        <w:t xml:space="preserve"> SLR, the selection process must follow a rigorous and unbiased search strategy aimed at bringing together the broadest possible range of original studies that provide a solid evidence base to directly answer the posed RQs. Therefore, building upon effective methodologies identified in previous studies, the search and analysis process was meticulously designed to comprehensively incorporate all published research results. To ensure both comprehensiveness and </w:t>
+      </w:r>
+      <w:r>
+        <w:rPr>
+          <w:rFonts w:ascii="Times New Roman" w:eastAsia="宋体" w:hAnsi="Times New Roman" w:cs="Times New Roman"/>
+        </w:rPr>
+        <w:lastRenderedPageBreak/>
+        <w:t>depth, our literature search and analysis followed a structured three-stage approach.</w:t>
       </w:r>
     </w:p>
     <w:p>
@@ -1799,16 +2295,8 @@
         <w:rPr>
           <w:rFonts w:ascii="Times New Roman" w:eastAsia="宋体" w:hAnsi="Times New Roman" w:cs="Times New Roman"/>
         </w:rPr>
-        <w:t xml:space="preserve">e.g., COCO-style </w:t>
-      </w:r>
-      <w:proofErr w:type="spellStart"/>
-      <w:r>
-        <w:rPr>
-          <w:rFonts w:ascii="Times New Roman" w:eastAsia="宋体" w:hAnsi="Times New Roman" w:cs="Times New Roman"/>
-        </w:rPr>
-        <w:t>keypoints</w:t>
-      </w:r>
-      <w:proofErr w:type="spellEnd"/>
+        <w:t>e.g., COCO-style keypoints</w:t>
+      </w:r>
       <w:r>
         <w:rPr>
           <w:rFonts w:ascii="Times New Roman" w:eastAsia="宋体" w:hAnsi="Times New Roman" w:cs="Times New Roman"/>
@@ -1841,30 +2329,8 @@
         <w:rPr>
           <w:rFonts w:ascii="Times New Roman" w:eastAsia="宋体" w:hAnsi="Times New Roman" w:cs="Times New Roman"/>
         </w:rPr>
-        <w:t xml:space="preserve">e.g., </w:t>
-      </w:r>
-      <w:proofErr w:type="spellStart"/>
-      <w:r>
-        <w:rPr>
-          <w:rFonts w:ascii="Times New Roman" w:eastAsia="宋体" w:hAnsi="Times New Roman" w:cs="Times New Roman"/>
-        </w:rPr>
-        <w:t>HRNet</w:t>
-      </w:r>
-      <w:proofErr w:type="spellEnd"/>
-      <w:r>
-        <w:rPr>
-          <w:rFonts w:ascii="Times New Roman" w:eastAsia="宋体" w:hAnsi="Times New Roman" w:cs="Times New Roman"/>
-        </w:rPr>
-        <w:t xml:space="preserve">, </w:t>
-      </w:r>
-      <w:proofErr w:type="spellStart"/>
-      <w:r>
-        <w:rPr>
-          <w:rFonts w:ascii="Times New Roman" w:eastAsia="宋体" w:hAnsi="Times New Roman" w:cs="Times New Roman"/>
-        </w:rPr>
-        <w:t>OpenPose</w:t>
-      </w:r>
-      <w:proofErr w:type="spellEnd"/>
+        <w:t>e.g., HRNet, OpenPose</w:t>
+      </w:r>
       <w:r>
         <w:rPr>
           <w:rFonts w:ascii="Times New Roman" w:eastAsia="宋体" w:hAnsi="Times New Roman" w:cs="Times New Roman"/>
@@ -1875,16 +2341,8 @@
         <w:rPr>
           <w:rFonts w:ascii="Times New Roman" w:eastAsia="宋体" w:hAnsi="Times New Roman" w:cs="Times New Roman"/>
         </w:rPr>
-        <w:t>DEKR-</w:t>
-      </w:r>
-      <w:proofErr w:type="spellStart"/>
-      <w:r>
-        <w:rPr>
-          <w:rFonts w:ascii="Times New Roman" w:eastAsia="宋体" w:hAnsi="Times New Roman" w:cs="Times New Roman"/>
-        </w:rPr>
-        <w:t>SPrior</w:t>
-      </w:r>
-      <w:proofErr w:type="spellEnd"/>
+        <w:t>DEKR-SPrior</w:t>
+      </w:r>
       <w:r>
         <w:rPr>
           <w:rFonts w:ascii="Times New Roman" w:eastAsia="宋体" w:hAnsi="Times New Roman" w:cs="Times New Roman"/>
@@ -1915,14 +2373,12 @@
         </w:rPr>
         <w:t>指标，而非仅</w:t>
       </w:r>
-      <w:proofErr w:type="spellStart"/>
       <w:r>
         <w:rPr>
           <w:rFonts w:ascii="Times New Roman" w:eastAsia="宋体" w:hAnsi="Times New Roman" w:cs="Times New Roman"/>
         </w:rPr>
         <w:t>mAP</w:t>
       </w:r>
-      <w:proofErr w:type="spellEnd"/>
       <w:r>
         <w:rPr>
           <w:rFonts w:ascii="Times New Roman" w:eastAsia="宋体" w:hAnsi="Times New Roman" w:cs="Times New Roman"/>
@@ -2040,14 +2496,12 @@
         </w:rPr>
         <w:t xml:space="preserve"> - </w:t>
       </w:r>
-      <w:proofErr w:type="gramStart"/>
       <w:r>
         <w:rPr>
           <w:rFonts w:ascii="Times New Roman" w:eastAsia="宋体" w:hAnsi="Times New Roman" w:cs="Times New Roman"/>
         </w:rPr>
         <w:t>纯对象</w:t>
       </w:r>
-      <w:proofErr w:type="gramEnd"/>
       <w:r>
         <w:rPr>
           <w:rFonts w:ascii="Times New Roman" w:eastAsia="宋体" w:hAnsi="Times New Roman" w:cs="Times New Roman"/>
@@ -2094,21 +2548,7 @@
         <w:rPr>
           <w:rFonts w:ascii="Times New Roman" w:eastAsia="宋体" w:hAnsi="Times New Roman" w:cs="Times New Roman"/>
         </w:rPr>
-        <w:t>只用边界</w:t>
-      </w:r>
-      <w:proofErr w:type="gramStart"/>
-      <w:r>
-        <w:rPr>
-          <w:rFonts w:ascii="Times New Roman" w:eastAsia="宋体" w:hAnsi="Times New Roman" w:cs="Times New Roman"/>
-        </w:rPr>
-        <w:t>框中心</w:t>
-      </w:r>
-      <w:proofErr w:type="gramEnd"/>
-      <w:r>
-        <w:rPr>
-          <w:rFonts w:ascii="Times New Roman" w:eastAsia="宋体" w:hAnsi="Times New Roman" w:cs="Times New Roman"/>
-        </w:rPr>
-        <w:t>作为采摘点）。</w:t>
+        <w:t>只用边界框中心作为采摘点）。</w:t>
       </w:r>
       <w:r>
         <w:rPr>
@@ -2138,19 +2578,11 @@
           <w:rFonts w:ascii="Times New Roman" w:eastAsia="宋体" w:hAnsi="Times New Roman" w:cs="Times New Roman"/>
         </w:rPr>
       </w:pPr>
-      <w:proofErr w:type="gramStart"/>
-      <w:r>
-        <w:rPr>
-          <w:rFonts w:ascii="Times New Roman" w:eastAsia="宋体" w:hAnsi="Times New Roman" w:cs="Times New Roman"/>
-        </w:rPr>
-        <w:t>无关键点预测</w:t>
-      </w:r>
-      <w:proofErr w:type="gramEnd"/>
-      <w:r>
-        <w:rPr>
-          <w:rFonts w:ascii="Times New Roman" w:eastAsia="宋体" w:hAnsi="Times New Roman" w:cs="Times New Roman"/>
-        </w:rPr>
-        <w:t>模块（</w:t>
+      <w:r>
+        <w:rPr>
+          <w:rFonts w:ascii="Times New Roman" w:eastAsia="宋体" w:hAnsi="Times New Roman" w:cs="Times New Roman"/>
+        </w:rPr>
+        <w:t>无关键点预测模块（</w:t>
       </w:r>
       <w:r>
         <w:rPr>
@@ -2174,21 +2606,7 @@
         <w:rPr>
           <w:rFonts w:ascii="Times New Roman" w:eastAsia="宋体" w:hAnsi="Times New Roman" w:cs="Times New Roman"/>
         </w:rPr>
-        <w:t>低质量数据（如合成图像</w:t>
-      </w:r>
-      <w:proofErr w:type="gramStart"/>
-      <w:r>
-        <w:rPr>
-          <w:rFonts w:ascii="Times New Roman" w:eastAsia="宋体" w:hAnsi="Times New Roman" w:cs="Times New Roman"/>
-        </w:rPr>
-        <w:t>无真实</w:t>
-      </w:r>
-      <w:proofErr w:type="gramEnd"/>
-      <w:r>
-        <w:rPr>
-          <w:rFonts w:ascii="Times New Roman" w:eastAsia="宋体" w:hAnsi="Times New Roman" w:cs="Times New Roman"/>
-        </w:rPr>
-        <w:t>标注）。</w:t>
+        <w:t>低质量数据（如合成图像无真实标注）。</w:t>
       </w:r>
       <w:r>
         <w:rPr>
@@ -2300,19 +2718,11 @@
         </w:rPr>
         <w:t xml:space="preserve"> - </w:t>
       </w:r>
-      <w:proofErr w:type="gramStart"/>
-      <w:r>
-        <w:rPr>
-          <w:rFonts w:ascii="Times New Roman" w:eastAsia="宋体" w:hAnsi="Times New Roman" w:cs="Times New Roman"/>
-        </w:rPr>
-        <w:t>非最新</w:t>
-      </w:r>
-      <w:proofErr w:type="gramEnd"/>
-      <w:r>
-        <w:rPr>
-          <w:rFonts w:ascii="Times New Roman" w:eastAsia="宋体" w:hAnsi="Times New Roman" w:cs="Times New Roman"/>
-        </w:rPr>
-        <w:t>综述重复内容。</w:t>
+      <w:r>
+        <w:rPr>
+          <w:rFonts w:ascii="Times New Roman" w:eastAsia="宋体" w:hAnsi="Times New Roman" w:cs="Times New Roman"/>
+        </w:rPr>
+        <w:t>非最新综述重复内容。</w:t>
       </w:r>
     </w:p>
     <w:p>
@@ -2347,7 +2757,7 @@
         <w:widowControl/>
         <w:jc w:val="left"/>
         <w:rPr>
-          <w:rFonts w:ascii="Times New Roman" w:eastAsia="宋体" w:hAnsi="Times New Roman" w:cs="Times New Roman" w:hint="eastAsia"/>
+          <w:rFonts w:ascii="Times New Roman" w:eastAsia="宋体" w:hAnsi="Times New Roman" w:cs="Times New Roman"/>
         </w:rPr>
       </w:pPr>
     </w:p>
@@ -2386,7 +2796,14 @@
         <w:rPr>
           <w:rFonts w:ascii="Times New Roman" w:hAnsi="Times New Roman" w:cs="Times New Roman"/>
         </w:rPr>
-        <w:t>The identified papers were then objectively reviewed and data was extracted and examined for the following items: research methodology, algorithm used, descriptive attributes of the models, journal, findings, and challenges and limitations. The results of this extraction were then documented in tabular format and evaluated independently by the authors and by an independent researcher to verify their eligibility. The resulting papers underwent thematic content analysis to reach a classification structure as discussed in the next section. Table 1 shows the distribution of the 80 articles in their respective journals. These articles were then analyzed to produce a taxonomy of deep learning applications in construction. Several iterations were conducted to reach the best taxonomy after reading the abstracts and the full papers. This resulted in six topics, which are: 1) equipment tracking, 2) crack detection, 3) construction work management, 4) sewer assessment, 5) 3D point cloud enhancement, and 6) miscellaneous topics. The detailed analysis of these topics is discussed in the next section</w:t>
+        <w:t xml:space="preserve">The identified papers were then objectively reviewed and data was extracted and examined for the following items: research methodology, algorithm used, descriptive attributes of the models, journal, findings, and challenges and limitations. The results of this extraction were then documented in tabular format and evaluated independently by the authors and by an independent researcher to verify their eligibility. The resulting papers underwent thematic content analysis to reach a classification structure as discussed in the next section. Table 1 shows the distribution of the 80 articles in their respective journals. These articles were then analyzed to produce a taxonomy of deep learning applications in construction. Several iterations were conducted to reach the best taxonomy after reading the abstracts and the full papers. This resulted in six topics, which are: 1) equipment tracking, 2) crack detection, 3) construction work management, 4) sewer assessment, 5) </w:t>
+      </w:r>
+      <w:r>
+        <w:rPr>
+          <w:rFonts w:ascii="Times New Roman" w:hAnsi="Times New Roman" w:cs="Times New Roman"/>
+        </w:rPr>
+        <w:lastRenderedPageBreak/>
+        <w:t>3D point cloud enhancement, and 6) miscellaneous topics. The detailed analysis of these topics is discussed in the next section</w:t>
       </w:r>
       <w:r>
         <w:rPr>
@@ -2802,25 +3219,7 @@
           <w:b/>
           <w:bCs/>
         </w:rPr>
-        <w:t xml:space="preserve">3. Overview of </w:t>
-      </w:r>
-      <w:proofErr w:type="spellStart"/>
-      <w:r>
-        <w:rPr>
-          <w:rFonts w:ascii="Times New Roman" w:hAnsi="Times New Roman" w:cs="Times New Roman"/>
-          <w:b/>
-          <w:bCs/>
-        </w:rPr>
-        <w:t>Keypoint</w:t>
-      </w:r>
-      <w:proofErr w:type="spellEnd"/>
-      <w:r>
-        <w:rPr>
-          <w:rFonts w:ascii="Times New Roman" w:hAnsi="Times New Roman" w:cs="Times New Roman"/>
-          <w:b/>
-          <w:bCs/>
-        </w:rPr>
-        <w:t xml:space="preserve"> Detection Techniques</w:t>
+        <w:t>3. Overview of Keypoint Detection Techniques</w:t>
       </w:r>
     </w:p>
     <w:p>
@@ -2872,21 +3271,7 @@
         <w:rPr>
           <w:rFonts w:ascii="Times New Roman" w:hAnsi="Times New Roman" w:cs="Times New Roman"/>
         </w:rPr>
-        <w:t xml:space="preserve">CNN, Hourglass, </w:t>
-      </w:r>
-      <w:proofErr w:type="spellStart"/>
-      <w:r>
-        <w:rPr>
-          <w:rFonts w:ascii="Times New Roman" w:hAnsi="Times New Roman" w:cs="Times New Roman"/>
-        </w:rPr>
-        <w:t>HRNet</w:t>
-      </w:r>
-      <w:proofErr w:type="spellEnd"/>
-      <w:r>
-        <w:rPr>
-          <w:rFonts w:ascii="Times New Roman" w:hAnsi="Times New Roman" w:cs="Times New Roman"/>
-        </w:rPr>
-        <w:t>, Transformer, etc.</w:t>
+        <w:t>CNN, Hourglass, HRNet, Transformer, etc.</w:t>
       </w:r>
       <w:r>
         <w:rPr>
@@ -2946,23 +3331,13 @@
         </w:rPr>
         <w:t xml:space="preserve">4. </w:t>
       </w:r>
-      <w:proofErr w:type="spellStart"/>
-      <w:r>
-        <w:rPr>
-          <w:rFonts w:ascii="Times New Roman" w:hAnsi="Times New Roman" w:cs="Times New Roman"/>
-          <w:b/>
-          <w:bCs/>
-        </w:rPr>
-        <w:t>Keypoint</w:t>
-      </w:r>
-      <w:proofErr w:type="spellEnd"/>
-      <w:r>
-        <w:rPr>
-          <w:rFonts w:ascii="Times New Roman" w:hAnsi="Times New Roman" w:cs="Times New Roman"/>
-          <w:b/>
-          <w:bCs/>
-        </w:rPr>
-        <w:t xml:space="preserve"> Detection </w:t>
+      <w:r>
+        <w:rPr>
+          <w:rFonts w:ascii="Times New Roman" w:hAnsi="Times New Roman" w:cs="Times New Roman"/>
+          <w:b/>
+          <w:bCs/>
+        </w:rPr>
+        <w:t xml:space="preserve">Keypoint Detection </w:t>
       </w:r>
       <w:r>
         <w:rPr>
@@ -2987,25 +3362,7 @@
           <w:b/>
           <w:bCs/>
         </w:rPr>
-        <w:t>应用场景占比：在五大应用场景中，作物生长活力</w:t>
-      </w:r>
-      <w:proofErr w:type="gramStart"/>
-      <w:r>
-        <w:rPr>
-          <w:rFonts w:ascii="Times New Roman" w:hAnsi="Times New Roman" w:cs="Times New Roman" w:hint="eastAsia"/>
-          <w:b/>
-          <w:bCs/>
-        </w:rPr>
-        <w:t>评估占</w:t>
-      </w:r>
-      <w:proofErr w:type="gramEnd"/>
-      <w:r>
-        <w:rPr>
-          <w:rFonts w:ascii="Times New Roman" w:hAnsi="Times New Roman" w:cs="Times New Roman" w:hint="eastAsia"/>
-          <w:b/>
-          <w:bCs/>
-        </w:rPr>
-        <w:t>比最高（</w:t>
+        <w:t>应用场景占比：在五大应用场景中，作物生长活力评估占比最高（</w:t>
       </w:r>
       <w:r>
         <w:rPr>
@@ -3037,25 +3394,7 @@
           <w:b/>
           <w:bCs/>
         </w:rPr>
-        <w:t>），病虫害</w:t>
-      </w:r>
-      <w:proofErr w:type="gramStart"/>
-      <w:r>
-        <w:rPr>
-          <w:rFonts w:ascii="Times New Roman" w:hAnsi="Times New Roman" w:cs="Times New Roman" w:hint="eastAsia"/>
-          <w:b/>
-          <w:bCs/>
-        </w:rPr>
-        <w:t>识别占</w:t>
-      </w:r>
-      <w:proofErr w:type="gramEnd"/>
-      <w:r>
-        <w:rPr>
-          <w:rFonts w:ascii="Times New Roman" w:hAnsi="Times New Roman" w:cs="Times New Roman" w:hint="eastAsia"/>
-          <w:b/>
-          <w:bCs/>
-        </w:rPr>
-        <w:t>比</w:t>
+        <w:t>），病虫害识别占比</w:t>
       </w:r>
       <w:r>
         <w:rPr>
@@ -3380,50 +3719,26 @@
           <w:bCs/>
         </w:rPr>
       </w:pPr>
-      <w:proofErr w:type="spellStart"/>
-      <w:r>
-        <w:rPr>
-          <w:rFonts w:ascii="Times New Roman" w:hAnsi="Times New Roman" w:cs="Times New Roman" w:hint="eastAsia"/>
-          <w:b/>
-          <w:bCs/>
-        </w:rPr>
-        <w:t>Keypoint</w:t>
-      </w:r>
-      <w:proofErr w:type="spellEnd"/>
-      <w:r>
-        <w:rPr>
-          <w:rFonts w:ascii="Times New Roman" w:hAnsi="Times New Roman" w:cs="Times New Roman" w:hint="eastAsia"/>
-          <w:b/>
-          <w:bCs/>
-        </w:rPr>
-        <w:t xml:space="preserve"> detection evaluation metrics</w:t>
-      </w:r>
-    </w:p>
-    <w:p>
-      <w:pPr>
-        <w:rPr>
-          <w:rFonts w:ascii="Times New Roman" w:hAnsi="Times New Roman" w:cs="Times New Roman"/>
-        </w:rPr>
-      </w:pPr>
-      <w:r>
-        <w:rPr>
-          <w:rFonts w:ascii="Times New Roman" w:hAnsi="Times New Roman" w:cs="Times New Roman"/>
-        </w:rPr>
-        <w:t xml:space="preserve">Evaluation metrics such as precision, recall, and average precision can intuitively reflect the performance of the algorithm in the detection process. In the field of </w:t>
-      </w:r>
-      <w:proofErr w:type="spellStart"/>
-      <w:r>
-        <w:rPr>
-          <w:rFonts w:ascii="Times New Roman" w:hAnsi="Times New Roman" w:cs="Times New Roman"/>
-        </w:rPr>
-        <w:t>keypoint</w:t>
-      </w:r>
-      <w:proofErr w:type="spellEnd"/>
-      <w:r>
-        <w:rPr>
-          <w:rFonts w:ascii="Times New Roman" w:hAnsi="Times New Roman" w:cs="Times New Roman"/>
-        </w:rPr>
-        <w:t xml:space="preserve"> detection,</w:t>
+      <w:r>
+        <w:rPr>
+          <w:rFonts w:ascii="Times New Roman" w:hAnsi="Times New Roman" w:cs="Times New Roman" w:hint="eastAsia"/>
+          <w:b/>
+          <w:bCs/>
+        </w:rPr>
+        <w:t>Keypoint detection evaluation metrics</w:t>
+      </w:r>
+    </w:p>
+    <w:p>
+      <w:pPr>
+        <w:rPr>
+          <w:rFonts w:ascii="Times New Roman" w:hAnsi="Times New Roman" w:cs="Times New Roman"/>
+        </w:rPr>
+      </w:pPr>
+      <w:r>
+        <w:rPr>
+          <w:rFonts w:ascii="Times New Roman" w:hAnsi="Times New Roman" w:cs="Times New Roman"/>
+        </w:rPr>
+        <w:t>Evaluation metrics such as precision, recall, and average precision can intuitively reflect the performance of the algorithm in the detection process. In the field of keypoint detection,</w:t>
       </w:r>
       <w:r>
         <w:rPr>
@@ -3435,154 +3750,14 @@
         <w:rPr>
           <w:rFonts w:ascii="Times New Roman" w:hAnsi="Times New Roman" w:cs="Times New Roman"/>
         </w:rPr>
-        <w:t xml:space="preserve">the evaluation metrics for accuracy and precision include </w:t>
-      </w:r>
-      <w:proofErr w:type="gramStart"/>
-      <w:r>
-        <w:rPr>
-          <w:rFonts w:ascii="Times New Roman" w:hAnsi="Times New Roman" w:cs="Times New Roman"/>
-        </w:rPr>
-        <w:t>PCK(</w:t>
-      </w:r>
-      <w:proofErr w:type="gramEnd"/>
-      <w:r>
-        <w:rPr>
-          <w:rFonts w:ascii="Times New Roman" w:hAnsi="Times New Roman" w:cs="Times New Roman"/>
-        </w:rPr>
-        <w:t xml:space="preserve">Percentage of Correct </w:t>
-      </w:r>
-      <w:proofErr w:type="spellStart"/>
-      <w:r>
-        <w:rPr>
-          <w:rFonts w:ascii="Times New Roman" w:hAnsi="Times New Roman" w:cs="Times New Roman"/>
-        </w:rPr>
-        <w:t>Keypoints</w:t>
-      </w:r>
-      <w:proofErr w:type="spellEnd"/>
-      <w:r>
-        <w:rPr>
-          <w:rFonts w:ascii="Times New Roman" w:hAnsi="Times New Roman" w:cs="Times New Roman"/>
-        </w:rPr>
-        <w:t xml:space="preserve">), </w:t>
-      </w:r>
-      <w:proofErr w:type="gramStart"/>
-      <w:r>
-        <w:rPr>
-          <w:rFonts w:ascii="Times New Roman" w:hAnsi="Times New Roman" w:cs="Times New Roman"/>
-        </w:rPr>
-        <w:t>OKS(</w:t>
-      </w:r>
-      <w:proofErr w:type="gramEnd"/>
-      <w:r>
-        <w:rPr>
-          <w:rFonts w:ascii="Times New Roman" w:hAnsi="Times New Roman" w:cs="Times New Roman"/>
-        </w:rPr>
-        <w:t xml:space="preserve">Object </w:t>
-      </w:r>
-      <w:proofErr w:type="spellStart"/>
-      <w:r>
-        <w:rPr>
-          <w:rFonts w:ascii="Times New Roman" w:hAnsi="Times New Roman" w:cs="Times New Roman"/>
-        </w:rPr>
-        <w:t>Keypoint</w:t>
-      </w:r>
-      <w:proofErr w:type="spellEnd"/>
-      <w:r>
-        <w:rPr>
-          <w:rFonts w:ascii="Times New Roman" w:hAnsi="Times New Roman" w:cs="Times New Roman"/>
-        </w:rPr>
-        <w:t xml:space="preserve"> Similarity) and </w:t>
-      </w:r>
-      <w:proofErr w:type="gramStart"/>
-      <w:r>
-        <w:rPr>
-          <w:rFonts w:ascii="Times New Roman" w:hAnsi="Times New Roman" w:cs="Times New Roman"/>
-        </w:rPr>
-        <w:t>AP(</w:t>
-      </w:r>
-      <w:proofErr w:type="gramEnd"/>
-      <w:r>
-        <w:rPr>
-          <w:rFonts w:ascii="Times New Roman" w:hAnsi="Times New Roman" w:cs="Times New Roman"/>
-        </w:rPr>
-        <w:t xml:space="preserve">Average Precision) calculated by OKS. They have different focuses: PCK counts the proportion of predicted </w:t>
-      </w:r>
-      <w:proofErr w:type="spellStart"/>
-      <w:r>
-        <w:rPr>
-          <w:rFonts w:ascii="Times New Roman" w:hAnsi="Times New Roman" w:cs="Times New Roman"/>
-        </w:rPr>
-        <w:t>keypoints</w:t>
-      </w:r>
-      <w:proofErr w:type="spellEnd"/>
-      <w:r>
-        <w:rPr>
-          <w:rFonts w:ascii="Times New Roman" w:hAnsi="Times New Roman" w:cs="Times New Roman"/>
-        </w:rPr>
-        <w:t xml:space="preserve"> falling near the real position by setting a pixel distance threshold (e.g., a percentage of the object size or a fixed pixel value as a </w:t>
+        <w:t xml:space="preserve">the evaluation metrics for accuracy and precision include PCK(Percentage of Correct Keypoints), OKS(Object Keypoint Similarity) and AP(Average Precision) calculated by OKS. They have different focuses: PCK counts the proportion of predicted keypoints falling near the real position by setting a pixel distance threshold (e.g., a percentage of the object size or a fixed pixel value as a </w:t>
       </w:r>
       <w:r>
         <w:rPr>
           <w:rFonts w:ascii="Times New Roman" w:hAnsi="Times New Roman" w:cs="Times New Roman"/>
         </w:rPr>
         <w:lastRenderedPageBreak/>
-        <w:t xml:space="preserve">tolerance range), which intuitively reflects whether the localization accuracy meets the requirements of the application; OKS introduces the object scale and visibility weights, and calculates the normalized distances between predicted </w:t>
-      </w:r>
-      <w:proofErr w:type="spellStart"/>
-      <w:r>
-        <w:rPr>
-          <w:rFonts w:ascii="Times New Roman" w:hAnsi="Times New Roman" w:cs="Times New Roman"/>
-        </w:rPr>
-        <w:t>keypoints</w:t>
-      </w:r>
-      <w:proofErr w:type="spellEnd"/>
-      <w:r>
-        <w:rPr>
-          <w:rFonts w:ascii="Times New Roman" w:hAnsi="Times New Roman" w:cs="Times New Roman"/>
-        </w:rPr>
-        <w:t xml:space="preserve"> and the real points (taking into account the object size scaling) and assigns lower weights to the occluded </w:t>
-      </w:r>
-      <w:proofErr w:type="spellStart"/>
-      <w:r>
-        <w:rPr>
-          <w:rFonts w:ascii="Times New Roman" w:hAnsi="Times New Roman" w:cs="Times New Roman"/>
-        </w:rPr>
-        <w:t>keypoints</w:t>
-      </w:r>
-      <w:proofErr w:type="spellEnd"/>
-      <w:r>
-        <w:rPr>
-          <w:rFonts w:ascii="Times New Roman" w:hAnsi="Times New Roman" w:cs="Times New Roman"/>
-        </w:rPr>
-        <w:t xml:space="preserve">. The lower weight is given to the occluded </w:t>
-      </w:r>
-      <w:proofErr w:type="spellStart"/>
-      <w:r>
-        <w:rPr>
-          <w:rFonts w:ascii="Times New Roman" w:hAnsi="Times New Roman" w:cs="Times New Roman"/>
-        </w:rPr>
-        <w:t>keypoints</w:t>
-      </w:r>
-      <w:proofErr w:type="spellEnd"/>
-      <w:r>
-        <w:rPr>
-          <w:rFonts w:ascii="Times New Roman" w:hAnsi="Times New Roman" w:cs="Times New Roman"/>
-        </w:rPr>
-        <w:t xml:space="preserve"> to better fit the actual detection scenarios, e.g., when part of the limb is occluded. AP (Average Precision) is the core index to measure the overall performance of the model, which is used to comprehensively evaluate the detection accuracy of the model for </w:t>
-      </w:r>
-      <w:proofErr w:type="spellStart"/>
-      <w:r>
-        <w:rPr>
-          <w:rFonts w:ascii="Times New Roman" w:hAnsi="Times New Roman" w:cs="Times New Roman"/>
-        </w:rPr>
-        <w:t>keypoints</w:t>
-      </w:r>
-      <w:proofErr w:type="spellEnd"/>
-      <w:r>
-        <w:rPr>
-          <w:rFonts w:ascii="Times New Roman" w:hAnsi="Times New Roman" w:cs="Times New Roman"/>
-        </w:rPr>
-        <w:t xml:space="preserve"> under different confidence thresholds. The next section will focus on these three metrics.</w:t>
+        <w:t>tolerance range), which intuitively reflects whether the localization accuracy meets the requirements of the application; OKS introduces the object scale and visibility weights, and calculates the normalized distances between predicted keypoints and the real points (taking into account the object size scaling) and assigns lower weights to the occluded keypoints. The lower weight is given to the occluded keypoints to better fit the actual detection scenarios, e.g., when part of the limb is occluded. AP (Average Precision) is the core index to measure the overall performance of the model, which is used to comprehensively evaluate the detection accuracy of the model for keypoints under different confidence thresholds. The next section will focus on these three metrics.</w:t>
       </w:r>
     </w:p>
     <w:p>
@@ -3625,16 +3800,8 @@
         <w:rPr>
           <w:rFonts w:ascii="Times New Roman" w:hAnsi="Times New Roman" w:cs="Times New Roman" w:hint="eastAsia"/>
         </w:rPr>
-        <w:t xml:space="preserve">correct </w:t>
-      </w:r>
-      <w:proofErr w:type="spellStart"/>
-      <w:r>
-        <w:rPr>
-          <w:rFonts w:ascii="Times New Roman" w:hAnsi="Times New Roman" w:cs="Times New Roman" w:hint="eastAsia"/>
-        </w:rPr>
-        <w:t>keypoints</w:t>
-      </w:r>
-      <w:proofErr w:type="spellEnd"/>
+        <w:t>correct keypoints</w:t>
+      </w:r>
       <w:r>
         <w:rPr>
           <w:rFonts w:ascii="Times New Roman" w:hAnsi="Times New Roman" w:cs="Times New Roman"/>
@@ -3652,35 +3819,7 @@
         <w:rPr>
           <w:rFonts w:ascii="Times New Roman" w:hAnsi="Times New Roman" w:cs="Times New Roman"/>
         </w:rPr>
-        <w:t xml:space="preserve">PCK represents the proportion of correct </w:t>
-      </w:r>
-      <w:proofErr w:type="spellStart"/>
-      <w:r>
-        <w:rPr>
-          <w:rFonts w:ascii="Times New Roman" w:hAnsi="Times New Roman" w:cs="Times New Roman"/>
-        </w:rPr>
-        <w:t>keypoint</w:t>
-      </w:r>
-      <w:proofErr w:type="spellEnd"/>
-      <w:r>
-        <w:rPr>
-          <w:rFonts w:ascii="Times New Roman" w:hAnsi="Times New Roman" w:cs="Times New Roman"/>
-        </w:rPr>
-        <w:t xml:space="preserve"> estimation. It computes the proportion of detected </w:t>
-      </w:r>
-      <w:proofErr w:type="spellStart"/>
-      <w:r>
-        <w:rPr>
-          <w:rFonts w:ascii="Times New Roman" w:hAnsi="Times New Roman" w:cs="Times New Roman"/>
-        </w:rPr>
-        <w:t>keypoints</w:t>
-      </w:r>
-      <w:proofErr w:type="spellEnd"/>
-      <w:r>
-        <w:rPr>
-          <w:rFonts w:ascii="Times New Roman" w:hAnsi="Times New Roman" w:cs="Times New Roman"/>
-        </w:rPr>
-        <w:t xml:space="preserve"> whose normalized distance with their corresponding ground truth (GT) is less than the threshold, which is defined as follows:</w:t>
+        <w:t>PCK represents the proportion of correct keypoint estimation. It computes the proportion of detected keypoints whose normalized distance with their corresponding ground truth (GT) is less than the threshold, which is defined as follows:</w:t>
       </w:r>
     </w:p>
     <w:p>
@@ -4209,21 +4348,7 @@
         <w:rPr>
           <w:rFonts w:ascii="Times New Roman" w:hAnsi="Times New Roman" w:cs="Times New Roman" w:hint="eastAsia"/>
         </w:rPr>
-        <w:t xml:space="preserve">Object </w:t>
-      </w:r>
-      <w:proofErr w:type="spellStart"/>
-      <w:r>
-        <w:rPr>
-          <w:rFonts w:ascii="Times New Roman" w:hAnsi="Times New Roman" w:cs="Times New Roman" w:hint="eastAsia"/>
-        </w:rPr>
-        <w:t>keypoint</w:t>
-      </w:r>
-      <w:proofErr w:type="spellEnd"/>
-      <w:r>
-        <w:rPr>
-          <w:rFonts w:ascii="Times New Roman" w:hAnsi="Times New Roman" w:cs="Times New Roman" w:hint="eastAsia"/>
-        </w:rPr>
-        <w:t xml:space="preserve"> similarity</w:t>
+        <w:t>Object keypoint similarity</w:t>
       </w:r>
       <w:r>
         <w:rPr>
@@ -4645,14 +4770,12 @@
           <w:rFonts w:ascii="Times New Roman" w:hAnsi="Times New Roman" w:cs="Times New Roman"/>
         </w:rPr>
       </w:pPr>
-      <w:proofErr w:type="spellStart"/>
       <w:r>
         <w:rPr>
           <w:rFonts w:ascii="Times New Roman" w:hAnsi="Times New Roman" w:cs="Times New Roman" w:hint="eastAsia"/>
         </w:rPr>
         <w:t>mAP</w:t>
       </w:r>
-      <w:proofErr w:type="spellEnd"/>
     </w:p>
     <w:p>
       <w:pPr>
@@ -4942,21 +5065,7 @@
               <w:rPr>
                 <w:rFonts w:ascii="Times New Roman" w:hAnsi="Times New Roman" w:cs="Times New Roman"/>
               </w:rPr>
-              <w:t xml:space="preserve">% of correct </w:t>
-            </w:r>
-            <w:proofErr w:type="spellStart"/>
-            <w:r>
-              <w:rPr>
-                <w:rFonts w:ascii="Times New Roman" w:hAnsi="Times New Roman" w:cs="Times New Roman"/>
-              </w:rPr>
-              <w:t>keypoints</w:t>
-            </w:r>
-            <w:proofErr w:type="spellEnd"/>
-            <w:r>
-              <w:rPr>
-                <w:rFonts w:ascii="Times New Roman" w:hAnsi="Times New Roman" w:cs="Times New Roman"/>
-              </w:rPr>
-              <w:t xml:space="preserve"> within threshold α</w:t>
+              <w:t>% of correct keypoints within threshold α</w:t>
             </w:r>
           </w:p>
         </w:tc>
@@ -5084,21 +5193,7 @@
               <w:rPr>
                 <w:rFonts w:ascii="Times New Roman" w:hAnsi="Times New Roman" w:cs="Times New Roman"/>
               </w:rPr>
-              <w:t xml:space="preserve">Object </w:t>
-            </w:r>
-            <w:proofErr w:type="spellStart"/>
-            <w:r>
-              <w:rPr>
-                <w:rFonts w:ascii="Times New Roman" w:hAnsi="Times New Roman" w:cs="Times New Roman"/>
-              </w:rPr>
-              <w:t>Keypoint</w:t>
-            </w:r>
-            <w:proofErr w:type="spellEnd"/>
-            <w:r>
-              <w:rPr>
-                <w:rFonts w:ascii="Times New Roman" w:hAnsi="Times New Roman" w:cs="Times New Roman"/>
-              </w:rPr>
-              <w:t xml:space="preserve"> Similarity</w:t>
+              <w:t>Object Keypoint Similarity</w:t>
             </w:r>
           </w:p>
         </w:tc>
@@ -5334,14 +5429,13 @@
                 <w:rFonts w:ascii="Times New Roman" w:hAnsi="Times New Roman" w:cs="Times New Roman"/>
               </w:rPr>
             </w:pPr>
-            <w:proofErr w:type="spellStart"/>
             <w:r>
               <w:rPr>
                 <w:rFonts w:ascii="Times New Roman" w:hAnsi="Times New Roman" w:cs="Times New Roman" w:hint="eastAsia"/>
               </w:rPr>
+              <w:lastRenderedPageBreak/>
               <w:t>mAP</w:t>
             </w:r>
-            <w:proofErr w:type="spellEnd"/>
           </w:p>
         </w:tc>
         <w:tc>
@@ -5443,6 +5537,60 @@
           <w:rFonts w:ascii="Times New Roman" w:hAnsi="Times New Roman" w:cs="Times New Roman"/>
         </w:rPr>
       </w:pPr>
+      <w:r>
+        <w:rPr>
+          <w:rFonts w:ascii="Times New Roman" w:hAnsi="Times New Roman" w:cs="Times New Roman"/>
+          <w:noProof/>
+        </w:rPr>
+        <w:drawing>
+          <wp:inline distT="0" distB="0" distL="0" distR="0" wp14:anchorId="416F8CED" wp14:editId="37AE48C6">
+            <wp:extent cx="5274310" cy="3109595"/>
+            <wp:effectExtent l="0" t="0" r="2540" b="0"/>
+            <wp:docPr id="678336717" name="图片 1"/>
+            <wp:cNvGraphicFramePr>
+              <a:graphicFrameLocks xmlns:a="http://schemas.openxmlformats.org/drawingml/2006/main" noChangeAspect="1"/>
+            </wp:cNvGraphicFramePr>
+            <a:graphic xmlns:a="http://schemas.openxmlformats.org/drawingml/2006/main">
+              <a:graphicData uri="http://schemas.openxmlformats.org/drawingml/2006/picture">
+                <pic:pic xmlns:pic="http://schemas.openxmlformats.org/drawingml/2006/picture">
+                  <pic:nvPicPr>
+                    <pic:cNvPr id="0" name="Picture 1"/>
+                    <pic:cNvPicPr>
+                      <a:picLocks noChangeAspect="1" noChangeArrowheads="1"/>
+                    </pic:cNvPicPr>
+                  </pic:nvPicPr>
+                  <pic:blipFill>
+                    <a:blip r:embed="rId10" cstate="print">
+                      <a:extLst>
+                        <a:ext uri="{28A0092B-C50C-407E-A947-70E740481C1C}">
+                          <a14:useLocalDpi xmlns:a14="http://schemas.microsoft.com/office/drawing/2010/main" val="0"/>
+                        </a:ext>
+                      </a:extLst>
+                    </a:blip>
+                    <a:srcRect/>
+                    <a:stretch>
+                      <a:fillRect/>
+                    </a:stretch>
+                  </pic:blipFill>
+                  <pic:spPr bwMode="auto">
+                    <a:xfrm>
+                      <a:off x="0" y="0"/>
+                      <a:ext cx="5274310" cy="3109595"/>
+                    </a:xfrm>
+                    <a:prstGeom prst="rect">
+                      <a:avLst/>
+                    </a:prstGeom>
+                    <a:noFill/>
+                    <a:ln>
+                      <a:noFill/>
+                    </a:ln>
+                  </pic:spPr>
+                </pic:pic>
+              </a:graphicData>
+            </a:graphic>
+          </wp:inline>
+        </w:drawing>
+      </w:r>
     </w:p>
     <w:p>
       <w:pPr>
@@ -5884,6 +6032,7 @@
         <w:rPr>
           <w:rFonts w:ascii="Times New Roman" w:eastAsia="宋体" w:hAnsi="Times New Roman" w:cs="Times New Roman"/>
         </w:rPr>
+        <w:lastRenderedPageBreak/>
         <w:t>Conceptualization: E.M. and S.N.; Data curation and visualization: JY.C., J.W; Writing original draft: JY.C.; Review, and editing: J.R., J.W. and S.N.; Funding acquisition: J.R. and S.N.</w:t>
       </w:r>
     </w:p>
@@ -7537,6 +7686,155 @@
     </w:lvl>
   </w:abstractNum>
   <w:abstractNum w:abstractNumId="12" w15:restartNumberingAfterBreak="0">
+    <w:nsid w:val="5E8E2E3B"/>
+    <w:multiLevelType w:val="multilevel"/>
+    <w:tmpl w:val="9E2A48F8"/>
+    <w:lvl w:ilvl="0">
+      <w:start w:val="1"/>
+      <w:numFmt w:val="bullet"/>
+      <w:lvlText w:val=""/>
+      <w:lvlJc w:val="left"/>
+      <w:pPr>
+        <w:tabs>
+          <w:tab w:val="num" w:pos="720"/>
+        </w:tabs>
+        <w:ind w:left="720" w:hanging="360"/>
+      </w:pPr>
+      <w:rPr>
+        <w:rFonts w:ascii="Symbol" w:hAnsi="Symbol" w:hint="default"/>
+        <w:sz w:val="20"/>
+      </w:rPr>
+    </w:lvl>
+    <w:lvl w:ilvl="1" w:tentative="1">
+      <w:start w:val="1"/>
+      <w:numFmt w:val="bullet"/>
+      <w:lvlText w:val="o"/>
+      <w:lvlJc w:val="left"/>
+      <w:pPr>
+        <w:tabs>
+          <w:tab w:val="num" w:pos="1440"/>
+        </w:tabs>
+        <w:ind w:left="1440" w:hanging="360"/>
+      </w:pPr>
+      <w:rPr>
+        <w:rFonts w:ascii="Courier New" w:hAnsi="Courier New" w:hint="default"/>
+        <w:sz w:val="20"/>
+      </w:rPr>
+    </w:lvl>
+    <w:lvl w:ilvl="2" w:tentative="1">
+      <w:start w:val="1"/>
+      <w:numFmt w:val="bullet"/>
+      <w:lvlText w:val=""/>
+      <w:lvlJc w:val="left"/>
+      <w:pPr>
+        <w:tabs>
+          <w:tab w:val="num" w:pos="2160"/>
+        </w:tabs>
+        <w:ind w:left="2160" w:hanging="360"/>
+      </w:pPr>
+      <w:rPr>
+        <w:rFonts w:ascii="Wingdings" w:hAnsi="Wingdings" w:hint="default"/>
+        <w:sz w:val="20"/>
+      </w:rPr>
+    </w:lvl>
+    <w:lvl w:ilvl="3" w:tentative="1">
+      <w:start w:val="1"/>
+      <w:numFmt w:val="bullet"/>
+      <w:lvlText w:val=""/>
+      <w:lvlJc w:val="left"/>
+      <w:pPr>
+        <w:tabs>
+          <w:tab w:val="num" w:pos="2880"/>
+        </w:tabs>
+        <w:ind w:left="2880" w:hanging="360"/>
+      </w:pPr>
+      <w:rPr>
+        <w:rFonts w:ascii="Wingdings" w:hAnsi="Wingdings" w:hint="default"/>
+        <w:sz w:val="20"/>
+      </w:rPr>
+    </w:lvl>
+    <w:lvl w:ilvl="4" w:tentative="1">
+      <w:start w:val="1"/>
+      <w:numFmt w:val="bullet"/>
+      <w:lvlText w:val=""/>
+      <w:lvlJc w:val="left"/>
+      <w:pPr>
+        <w:tabs>
+          <w:tab w:val="num" w:pos="3600"/>
+        </w:tabs>
+        <w:ind w:left="3600" w:hanging="360"/>
+      </w:pPr>
+      <w:rPr>
+        <w:rFonts w:ascii="Wingdings" w:hAnsi="Wingdings" w:hint="default"/>
+        <w:sz w:val="20"/>
+      </w:rPr>
+    </w:lvl>
+    <w:lvl w:ilvl="5" w:tentative="1">
+      <w:start w:val="1"/>
+      <w:numFmt w:val="bullet"/>
+      <w:lvlText w:val=""/>
+      <w:lvlJc w:val="left"/>
+      <w:pPr>
+        <w:tabs>
+          <w:tab w:val="num" w:pos="4320"/>
+        </w:tabs>
+        <w:ind w:left="4320" w:hanging="360"/>
+      </w:pPr>
+      <w:rPr>
+        <w:rFonts w:ascii="Wingdings" w:hAnsi="Wingdings" w:hint="default"/>
+        <w:sz w:val="20"/>
+      </w:rPr>
+    </w:lvl>
+    <w:lvl w:ilvl="6" w:tentative="1">
+      <w:start w:val="1"/>
+      <w:numFmt w:val="bullet"/>
+      <w:lvlText w:val=""/>
+      <w:lvlJc w:val="left"/>
+      <w:pPr>
+        <w:tabs>
+          <w:tab w:val="num" w:pos="5040"/>
+        </w:tabs>
+        <w:ind w:left="5040" w:hanging="360"/>
+      </w:pPr>
+      <w:rPr>
+        <w:rFonts w:ascii="Wingdings" w:hAnsi="Wingdings" w:hint="default"/>
+        <w:sz w:val="20"/>
+      </w:rPr>
+    </w:lvl>
+    <w:lvl w:ilvl="7" w:tentative="1">
+      <w:start w:val="1"/>
+      <w:numFmt w:val="bullet"/>
+      <w:lvlText w:val=""/>
+      <w:lvlJc w:val="left"/>
+      <w:pPr>
+        <w:tabs>
+          <w:tab w:val="num" w:pos="5760"/>
+        </w:tabs>
+        <w:ind w:left="5760" w:hanging="360"/>
+      </w:pPr>
+      <w:rPr>
+        <w:rFonts w:ascii="Wingdings" w:hAnsi="Wingdings" w:hint="default"/>
+        <w:sz w:val="20"/>
+      </w:rPr>
+    </w:lvl>
+    <w:lvl w:ilvl="8" w:tentative="1">
+      <w:start w:val="1"/>
+      <w:numFmt w:val="bullet"/>
+      <w:lvlText w:val=""/>
+      <w:lvlJc w:val="left"/>
+      <w:pPr>
+        <w:tabs>
+          <w:tab w:val="num" w:pos="6480"/>
+        </w:tabs>
+        <w:ind w:left="6480" w:hanging="360"/>
+      </w:pPr>
+      <w:rPr>
+        <w:rFonts w:ascii="Wingdings" w:hAnsi="Wingdings" w:hint="default"/>
+        <w:sz w:val="20"/>
+      </w:rPr>
+    </w:lvl>
+  </w:abstractNum>
+  <w:abstractNum w:abstractNumId="13" w15:restartNumberingAfterBreak="0">
     <w:nsid w:val="631A2BCC"/>
     <w:multiLevelType w:val="hybridMultilevel"/>
     <w:tmpl w:val="73BED6A6"/>
@@ -7649,7 +7947,7 @@
       </w:rPr>
     </w:lvl>
   </w:abstractNum>
-  <w:abstractNum w:abstractNumId="13" w15:restartNumberingAfterBreak="0">
+  <w:abstractNum w:abstractNumId="14" w15:restartNumberingAfterBreak="0">
     <w:nsid w:val="679C2060"/>
     <w:multiLevelType w:val="multilevel"/>
     <w:tmpl w:val="702CC892"/>
@@ -7798,7 +8096,7 @@
       </w:rPr>
     </w:lvl>
   </w:abstractNum>
-  <w:abstractNum w:abstractNumId="14" w15:restartNumberingAfterBreak="0">
+  <w:abstractNum w:abstractNumId="15" w15:restartNumberingAfterBreak="0">
     <w:nsid w:val="75620646"/>
     <w:multiLevelType w:val="multilevel"/>
     <w:tmpl w:val="BBDEE05C"/>
@@ -7947,7 +8245,7 @@
       </w:rPr>
     </w:lvl>
   </w:abstractNum>
-  <w:abstractNum w:abstractNumId="15" w15:restartNumberingAfterBreak="0">
+  <w:abstractNum w:abstractNumId="16" w15:restartNumberingAfterBreak="0">
     <w:nsid w:val="7FB7762F"/>
     <w:multiLevelType w:val="multilevel"/>
     <w:tmpl w:val="99AAB736"/>
@@ -8100,7 +8398,7 @@
     <w:abstractNumId w:val="1"/>
   </w:num>
   <w:num w:numId="2" w16cid:durableId="1810853906">
-    <w:abstractNumId w:val="14"/>
+    <w:abstractNumId w:val="15"/>
   </w:num>
   <w:num w:numId="3" w16cid:durableId="1109739285">
     <w:abstractNumId w:val="4"/>
@@ -8109,10 +8407,10 @@
     <w:abstractNumId w:val="9"/>
   </w:num>
   <w:num w:numId="5" w16cid:durableId="145587775">
-    <w:abstractNumId w:val="13"/>
+    <w:abstractNumId w:val="14"/>
   </w:num>
   <w:num w:numId="6" w16cid:durableId="237640825">
-    <w:abstractNumId w:val="15"/>
+    <w:abstractNumId w:val="16"/>
   </w:num>
   <w:num w:numId="7" w16cid:durableId="399057745">
     <w:abstractNumId w:val="0"/>
@@ -8133,7 +8431,7 @@
     <w:abstractNumId w:val="11"/>
   </w:num>
   <w:num w:numId="13" w16cid:durableId="1608583809">
-    <w:abstractNumId w:val="12"/>
+    <w:abstractNumId w:val="13"/>
   </w:num>
   <w:num w:numId="14" w16cid:durableId="499199462">
     <w:abstractNumId w:val="8"/>
@@ -8143,6 +8441,9 @@
   </w:num>
   <w:num w:numId="16" w16cid:durableId="898059435">
     <w:abstractNumId w:val="7"/>
+  </w:num>
+  <w:num w:numId="17" w16cid:durableId="1372420974">
+    <w:abstractNumId w:val="12"/>
   </w:num>
 </w:numbering>
 </file>

</xml_diff>